<commit_message>
Add a chapter 2 2.2
</commit_message>
<xml_diff>
--- a/EduSportPro_Proposal_Writing(IT).docx
+++ b/EduSportPro_Proposal_Writing(IT).docx
@@ -3600,7 +3600,7 @@
         </w:tabs>
         <w:spacing w:line="240" w:lineRule="auto"/>
         <w:rPr>
-          <w:rFonts w:ascii="Khmer OS Battambang" w:hAnsi="Khmer OS Battambang" w:cs="Khmer OS Battambang" w:hint="cs"/>
+          <w:rFonts w:ascii="Khmer OS Battambang" w:hAnsi="Khmer OS Battambang" w:cs="Khmer OS Battambang"/>
           <w:sz w:val="24"/>
           <w:szCs w:val="24"/>
           <w:cs/>
@@ -4018,6 +4018,7 @@
           <w:rFonts w:ascii="Khmer OS Muol" w:hAnsi="Khmer OS Muol" w:cs="Khmer OS Muol"/>
           <w:sz w:val="24"/>
           <w:szCs w:val="24"/>
+          <w:lang w:val="en-GB"/>
         </w:rPr>
       </w:pPr>
       <w:r>
@@ -6304,20 +6305,1136 @@
           <w:szCs w:val="24"/>
           <w:cs/>
         </w:rPr>
-        <w:t xml:space="preserve">.១ </w:t>
-      </w:r>
-    </w:p>
-    <w:p>
-      <w:pPr>
-        <w:rPr>
-          <w:rFonts w:ascii="Khmer OS Battambang" w:hAnsi="Khmer OS Battambang" w:cs="Khmer OS Battambang"/>
-          <w:sz w:val="24"/>
-          <w:szCs w:val="24"/>
-        </w:rPr>
-      </w:pPr>
-    </w:p>
-    <w:p>
-      <w:pPr>
+        <w:t>.១</w:t>
+      </w:r>
+      <w:r>
+        <w:rPr>
+          <w:rFonts w:ascii="Khmer OS Muol" w:hAnsi="Khmer OS Muol" w:cs="Khmer OS Muol"/>
+          <w:sz w:val="24"/>
+          <w:szCs w:val="24"/>
+        </w:rPr>
+        <w:t xml:space="preserve"> </w:t>
+      </w:r>
+      <w:r>
+        <w:rPr>
+          <w:rFonts w:ascii="Khmer OS Muol" w:hAnsi="Khmer OS Muol" w:cs="Khmer OS Muol" w:hint="cs"/>
+          <w:sz w:val="24"/>
+          <w:szCs w:val="24"/>
+          <w:cs/>
+        </w:rPr>
+        <w:t>ទស្សនៈទូទៅអំពីប្រព័ន្ធគ្រប់គ្រង</w:t>
+      </w:r>
+    </w:p>
+    <w:p>
+      <w:pPr>
+        <w:tabs>
+          <w:tab w:val="left" w:pos="540"/>
+        </w:tabs>
+        <w:jc w:val="both"/>
+        <w:rPr>
+          <w:rFonts w:ascii="Khmer OS Battambang" w:hAnsi="Khmer OS Battambang" w:cs="Khmer OS Battambang"/>
+          <w:sz w:val="24"/>
+          <w:szCs w:val="24"/>
+        </w:rPr>
+      </w:pPr>
+      <w:r>
+        <w:rPr>
+          <w:rFonts w:ascii="Khmer OS Muol" w:hAnsi="Khmer OS Muol" w:cs="Khmer OS Muol"/>
+          <w:sz w:val="24"/>
+          <w:szCs w:val="24"/>
+          <w:cs/>
+        </w:rPr>
+        <w:tab/>
+      </w:r>
+      <w:r>
+        <w:rPr>
+          <w:rFonts w:ascii="Khmer OS Battambang" w:hAnsi="Khmer OS Battambang" w:cs="Khmer OS Battambang"/>
+          <w:sz w:val="24"/>
+          <w:szCs w:val="24"/>
+          <w:cs/>
+        </w:rPr>
+        <w:t>ប្រព័ន្ធគ្រប់គ្រង (</w:t>
+      </w:r>
+      <w:r>
+        <w:rPr>
+          <w:rFonts w:ascii="Century" w:hAnsi="Century" w:cs="Khmer OS Battambang"/>
+          <w:sz w:val="24"/>
+          <w:szCs w:val="24"/>
+        </w:rPr>
+        <w:t>Management System</w:t>
+      </w:r>
+      <w:r>
+        <w:rPr>
+          <w:rFonts w:ascii="Khmer OS Battambang" w:hAnsi="Khmer OS Battambang" w:cs="Khmer OS Battambang"/>
+          <w:sz w:val="24"/>
+          <w:szCs w:val="24"/>
+        </w:rPr>
+        <w:t xml:space="preserve">) </w:t>
+      </w:r>
+      <w:r>
+        <w:rPr>
+          <w:rFonts w:ascii="Khmer OS Battambang" w:hAnsi="Khmer OS Battambang" w:cs="Khmer OS Battambang"/>
+          <w:sz w:val="24"/>
+          <w:szCs w:val="24"/>
+          <w:cs/>
+        </w:rPr>
+        <w:t>គឺជាសំណុំរចនាសម្ព័ន្ធ និងដំណើរការដែលត្រូវបានរៀបចំឡើង ដើម្បីជួយគ្រប់គ្រង គ្រប់គ្រងការងារ និងធនធាននានា នៅក្នុងអង្គការ ឱ្យមានប្រសិទ្ធភាព និងសម្រេចបានតាមគោលបំណងដែលបានកំណត់។ ប្រព័ន្ធគ្រប់គ្រងមានតួនាទីសំខាន់ក្នុងការរៀបចំការងារ ការបែងចែកភារកិច្ច ការត្រួតពិនិត្យ និងការវាយតម្លៃលទ្ធផលការងារ។</w:t>
+      </w:r>
+    </w:p>
+    <w:p>
+      <w:pPr>
+        <w:tabs>
+          <w:tab w:val="left" w:pos="540"/>
+        </w:tabs>
+        <w:rPr>
+          <w:rFonts w:ascii="Khmer OS Bokor" w:hAnsi="Khmer OS Bokor" w:cs="Khmer OS Bokor"/>
+          <w:sz w:val="24"/>
+          <w:szCs w:val="24"/>
+        </w:rPr>
+      </w:pPr>
+      <w:r>
+        <w:rPr>
+          <w:rFonts w:ascii="Khmer OS Battambang" w:hAnsi="Khmer OS Battambang" w:cs="Khmer OS Battambang"/>
+          <w:sz w:val="24"/>
+          <w:szCs w:val="24"/>
+          <w:cs/>
+        </w:rPr>
+        <w:tab/>
+      </w:r>
+      <w:r>
+        <w:rPr>
+          <w:rFonts w:ascii="Khmer OS Bokor" w:hAnsi="Khmer OS Bokor" w:cs="Khmer OS Bokor" w:hint="cs"/>
+          <w:sz w:val="24"/>
+          <w:szCs w:val="24"/>
+          <w:cs/>
+        </w:rPr>
+        <w:t>២.១.១ និយមន័យប្រព័ន្ធគ្រប់គ្រង</w:t>
+      </w:r>
+    </w:p>
+    <w:p>
+      <w:pPr>
+        <w:tabs>
+          <w:tab w:val="left" w:pos="540"/>
+        </w:tabs>
+        <w:jc w:val="both"/>
+        <w:rPr>
+          <w:rFonts w:ascii="Khmer OS Battambang" w:hAnsi="Khmer OS Battambang" w:cs="Khmer OS Battambang"/>
+          <w:sz w:val="24"/>
+          <w:szCs w:val="24"/>
+        </w:rPr>
+      </w:pPr>
+      <w:r>
+        <w:rPr>
+          <w:rFonts w:ascii="Khmer OS Battambang" w:hAnsi="Khmer OS Battambang" w:cs="Khmer OS Battambang"/>
+          <w:sz w:val="24"/>
+          <w:szCs w:val="24"/>
+          <w:cs/>
+        </w:rPr>
+        <w:tab/>
+      </w:r>
+      <w:r>
+        <w:rPr>
+          <w:rFonts w:ascii="Khmer OS Battambang" w:hAnsi="Khmer OS Battambang" w:cs="Khmer OS Battambang"/>
+          <w:sz w:val="24"/>
+          <w:szCs w:val="24"/>
+          <w:cs/>
+        </w:rPr>
+        <w:t>តាមទស្សនៈវិជ្ជាការ ប្រព័ន្ធគ្រប់គ្រង ត្រូវបានយល់ថាជាប្រព័ន្ធមួយ ដែលផ្សំឡើងដោយធាតុជាច្រើនដូចជា មនុស្ស ដំណើរការ បច្ចេកវិទ្យា និងទិន្នន័យ ដែលធ្វើការជាសហប្រតិបត្តិ ដើម្បីសម្រេចគោលដៅរួមរបស់អង្គការ។ ប្រព័ន្ធនេះអាចជាប្រព័ន្ធប្រពៃណី ឬប្រព័ន្ធឌីជីថល ដែលប្រើប្រាស់បច្ចេកវិទ្យាព័ត៌មាន ដើម្បីបង្កើនប្រសិទ្ធភាពការងារ។</w:t>
+      </w:r>
+    </w:p>
+    <w:p>
+      <w:pPr>
+        <w:tabs>
+          <w:tab w:val="left" w:pos="540"/>
+        </w:tabs>
+        <w:rPr>
+          <w:rFonts w:ascii="Khmer OS Bokor" w:hAnsi="Khmer OS Bokor" w:cs="Khmer OS Bokor"/>
+          <w:sz w:val="24"/>
+          <w:szCs w:val="24"/>
+        </w:rPr>
+      </w:pPr>
+      <w:r>
+        <w:rPr>
+          <w:rFonts w:ascii="Khmer OS Battambang" w:hAnsi="Khmer OS Battambang" w:cs="Khmer OS Battambang"/>
+          <w:sz w:val="24"/>
+          <w:szCs w:val="24"/>
+          <w:cs/>
+        </w:rPr>
+        <w:tab/>
+      </w:r>
+      <w:r>
+        <w:rPr>
+          <w:rFonts w:ascii="Khmer OS Bokor" w:hAnsi="Khmer OS Bokor" w:cs="Khmer OS Bokor" w:hint="cs"/>
+          <w:sz w:val="24"/>
+          <w:szCs w:val="24"/>
+          <w:cs/>
+        </w:rPr>
+        <w:t>២.១.២ ផ្នែកសំខាន់នៃប្រព័ន្ធគ្រប់គ្រង</w:t>
+      </w:r>
+    </w:p>
+    <w:p>
+      <w:pPr>
+        <w:tabs>
+          <w:tab w:val="left" w:pos="540"/>
+        </w:tabs>
+        <w:jc w:val="both"/>
+        <w:rPr>
+          <w:rFonts w:ascii="Khmer OS Battambang" w:hAnsi="Khmer OS Battambang" w:cs="Khmer OS Battambang"/>
+          <w:szCs w:val="24"/>
+        </w:rPr>
+      </w:pPr>
+      <w:r>
+        <w:rPr>
+          <w:rFonts w:ascii="Khmer OS Bokor" w:hAnsi="Khmer OS Bokor" w:cs="Khmer OS Bokor"/>
+          <w:sz w:val="24"/>
+          <w:szCs w:val="24"/>
+          <w:cs/>
+        </w:rPr>
+        <w:tab/>
+      </w:r>
+      <w:r>
+        <w:rPr>
+          <w:rFonts w:ascii="Khmer OS Battambang" w:hAnsi="Khmer OS Battambang" w:cs="Khmer OS Battambang"/>
+          <w:szCs w:val="24"/>
+          <w:cs/>
+        </w:rPr>
+        <w:t>ប្រព័ន្ធគ្រប់គ្រងមានធាតុផ្សំសំខាន់ៗ ដូចខាងក្រោម៖</w:t>
+      </w:r>
+    </w:p>
+    <w:p>
+      <w:pPr>
+        <w:pStyle w:val="ListParagraph"/>
+        <w:numPr>
+          <w:ilvl w:val="0"/>
+          <w:numId w:val="5"/>
+        </w:numPr>
+        <w:tabs>
+          <w:tab w:val="left" w:pos="540"/>
+        </w:tabs>
+        <w:jc w:val="both"/>
+        <w:rPr>
+          <w:rFonts w:ascii="Khmer OS Battambang" w:hAnsi="Khmer OS Battambang" w:cs="Khmer OS Battambang"/>
+          <w:sz w:val="24"/>
+          <w:szCs w:val="24"/>
+        </w:rPr>
+      </w:pPr>
+      <w:r>
+        <w:rPr>
+          <w:rFonts w:ascii="Khmer OS Battambang" w:hAnsi="Khmer OS Battambang" w:cs="Khmer OS Battambang"/>
+          <w:b/>
+          <w:bCs/>
+          <w:sz w:val="24"/>
+          <w:szCs w:val="24"/>
+          <w:cs/>
+        </w:rPr>
+        <w:t>មនុស្ស (</w:t>
+      </w:r>
+      <w:r>
+        <w:rPr>
+          <w:rFonts w:ascii="Century" w:hAnsi="Century" w:cs="Khmer OS Battambang"/>
+          <w:b/>
+          <w:bCs/>
+          <w:sz w:val="24"/>
+          <w:szCs w:val="24"/>
+        </w:rPr>
+        <w:t>People</w:t>
+      </w:r>
+      <w:r>
+        <w:rPr>
+          <w:rFonts w:ascii="Khmer OS Battambang" w:hAnsi="Khmer OS Battambang" w:cs="Khmer OS Battambang"/>
+          <w:b/>
+          <w:bCs/>
+          <w:sz w:val="24"/>
+          <w:szCs w:val="24"/>
+        </w:rPr>
+        <w:t>)</w:t>
+      </w:r>
+      <w:r>
+        <w:rPr>
+          <w:rFonts w:ascii="Khmer OS Battambang" w:hAnsi="Khmer OS Battambang" w:cs="Khmer OS Battambang"/>
+          <w:sz w:val="24"/>
+          <w:szCs w:val="24"/>
+          <w:cs/>
+        </w:rPr>
+        <w:t>៖ រួមមានអ្នកគ្រប់គ្រង បុគ្គលិក និងអ្នកប្រើប្រាស់ប្រព័ន្ធ ដែលមានតួនាទីសំខាន់ក្នុងការអនុវត្ត និងប្រើប្រាស់ប្រព័ន្ធ។</w:t>
+      </w:r>
+    </w:p>
+    <w:p>
+      <w:pPr>
+        <w:pStyle w:val="ListParagraph"/>
+        <w:numPr>
+          <w:ilvl w:val="0"/>
+          <w:numId w:val="5"/>
+        </w:numPr>
+        <w:tabs>
+          <w:tab w:val="left" w:pos="540"/>
+        </w:tabs>
+        <w:jc w:val="both"/>
+        <w:rPr>
+          <w:rFonts w:ascii="Khmer OS Battambang" w:hAnsi="Khmer OS Battambang" w:cs="Khmer OS Battambang"/>
+          <w:sz w:val="24"/>
+          <w:szCs w:val="24"/>
+        </w:rPr>
+      </w:pPr>
+      <w:r>
+        <w:rPr>
+          <w:rFonts w:ascii="Khmer OS Battambang" w:hAnsi="Khmer OS Battambang" w:cs="Khmer OS Battambang"/>
+          <w:b/>
+          <w:bCs/>
+          <w:sz w:val="24"/>
+          <w:szCs w:val="24"/>
+          <w:cs/>
+        </w:rPr>
+        <w:t>ដំណើរការ (</w:t>
+      </w:r>
+      <w:r>
+        <w:rPr>
+          <w:rFonts w:ascii="Century" w:hAnsi="Century" w:cs="Khmer OS Battambang"/>
+          <w:b/>
+          <w:bCs/>
+          <w:sz w:val="24"/>
+          <w:szCs w:val="24"/>
+        </w:rPr>
+        <w:t>Process</w:t>
+      </w:r>
+      <w:r>
+        <w:rPr>
+          <w:rFonts w:ascii="Khmer OS Battambang" w:hAnsi="Khmer OS Battambang" w:cs="Khmer OS Battambang"/>
+          <w:b/>
+          <w:bCs/>
+          <w:sz w:val="24"/>
+          <w:szCs w:val="24"/>
+        </w:rPr>
+        <w:t>)</w:t>
+      </w:r>
+      <w:r>
+        <w:rPr>
+          <w:rFonts w:ascii="Khmer OS Battambang" w:hAnsi="Khmer OS Battambang" w:cs="Khmer OS Battambang"/>
+          <w:sz w:val="24"/>
+          <w:szCs w:val="24"/>
+          <w:cs/>
+        </w:rPr>
+        <w:t>៖ ជាជំហាន ឬលំដាប់ការងារដែលត្រូវអនុវត្ត ដើម្បីឱ្យការងារប្រព្រឹត្តទៅយ៉ាងមានប្រសិទ្ធភាព។</w:t>
+      </w:r>
+    </w:p>
+    <w:p>
+      <w:pPr>
+        <w:pStyle w:val="ListParagraph"/>
+        <w:numPr>
+          <w:ilvl w:val="0"/>
+          <w:numId w:val="5"/>
+        </w:numPr>
+        <w:tabs>
+          <w:tab w:val="left" w:pos="540"/>
+        </w:tabs>
+        <w:jc w:val="both"/>
+        <w:rPr>
+          <w:rFonts w:ascii="Khmer OS Battambang" w:hAnsi="Khmer OS Battambang" w:cs="Khmer OS Battambang"/>
+          <w:sz w:val="24"/>
+          <w:szCs w:val="24"/>
+        </w:rPr>
+      </w:pPr>
+      <w:r>
+        <w:rPr>
+          <w:rFonts w:ascii="Khmer OS Battambang" w:hAnsi="Khmer OS Battambang" w:cs="Khmer OS Battambang"/>
+          <w:b/>
+          <w:bCs/>
+          <w:sz w:val="24"/>
+          <w:szCs w:val="24"/>
+          <w:cs/>
+        </w:rPr>
+        <w:t>បច្ចេកវិទ្យា (</w:t>
+      </w:r>
+      <w:r>
+        <w:rPr>
+          <w:rFonts w:ascii="Century" w:hAnsi="Century" w:cs="Khmer OS Battambang"/>
+          <w:b/>
+          <w:bCs/>
+          <w:sz w:val="24"/>
+          <w:szCs w:val="24"/>
+        </w:rPr>
+        <w:t>Technology</w:t>
+      </w:r>
+      <w:r>
+        <w:rPr>
+          <w:rFonts w:ascii="Khmer OS Battambang" w:hAnsi="Khmer OS Battambang" w:cs="Khmer OS Battambang"/>
+          <w:b/>
+          <w:bCs/>
+          <w:sz w:val="24"/>
+          <w:szCs w:val="24"/>
+        </w:rPr>
+        <w:t>)</w:t>
+      </w:r>
+      <w:r>
+        <w:rPr>
+          <w:rFonts w:ascii="Khmer OS Battambang" w:hAnsi="Khmer OS Battambang" w:cs="Khmer OS Battambang"/>
+          <w:sz w:val="24"/>
+          <w:szCs w:val="24"/>
+          <w:cs/>
+        </w:rPr>
+        <w:t>៖ រួមមានកុំព្យូទ័រ កម្មវិធី និងបណ្ដាញ ដែលជួយសម្រួលដល់ការគ្រប់គ្រង និងការរក្សាទុកទិន្នន័យ។</w:t>
+      </w:r>
+    </w:p>
+    <w:p>
+      <w:pPr>
+        <w:pStyle w:val="ListParagraph"/>
+        <w:numPr>
+          <w:ilvl w:val="0"/>
+          <w:numId w:val="5"/>
+        </w:numPr>
+        <w:tabs>
+          <w:tab w:val="left" w:pos="540"/>
+        </w:tabs>
+        <w:jc w:val="both"/>
+        <w:rPr>
+          <w:rFonts w:ascii="Khmer OS Battambang" w:hAnsi="Khmer OS Battambang" w:cs="Khmer OS Battambang"/>
+          <w:sz w:val="24"/>
+          <w:szCs w:val="24"/>
+        </w:rPr>
+      </w:pPr>
+      <w:r>
+        <w:rPr>
+          <w:rFonts w:ascii="Khmer OS Battambang" w:hAnsi="Khmer OS Battambang" w:cs="Khmer OS Battambang"/>
+          <w:b/>
+          <w:bCs/>
+          <w:sz w:val="24"/>
+          <w:szCs w:val="24"/>
+          <w:cs/>
+        </w:rPr>
+        <w:t>ទិន្នន័យ (</w:t>
+      </w:r>
+      <w:r>
+        <w:rPr>
+          <w:rFonts w:ascii="Century" w:hAnsi="Century" w:cs="Khmer OS Battambang"/>
+          <w:b/>
+          <w:bCs/>
+          <w:sz w:val="24"/>
+          <w:szCs w:val="24"/>
+        </w:rPr>
+        <w:t>Data</w:t>
+      </w:r>
+      <w:r>
+        <w:rPr>
+          <w:rFonts w:ascii="Khmer OS Battambang" w:hAnsi="Khmer OS Battambang" w:cs="Khmer OS Battambang"/>
+          <w:b/>
+          <w:bCs/>
+          <w:sz w:val="24"/>
+          <w:szCs w:val="24"/>
+        </w:rPr>
+        <w:t>)</w:t>
+      </w:r>
+      <w:r>
+        <w:rPr>
+          <w:rFonts w:ascii="Khmer OS Battambang" w:hAnsi="Khmer OS Battambang" w:cs="Khmer OS Battambang"/>
+          <w:sz w:val="24"/>
+          <w:szCs w:val="24"/>
+          <w:cs/>
+        </w:rPr>
+        <w:t>៖ ជាព័ត៌មានដែលត្រូវបានប្រមូល រក្សាទុក និងប្រើប្រាស់សម្រាប់ការវិភាគ និងការសម្រេចចិត្ត។</w:t>
+      </w:r>
+    </w:p>
+    <w:p>
+      <w:pPr>
+        <w:tabs>
+          <w:tab w:val="left" w:pos="540"/>
+        </w:tabs>
+        <w:ind w:left="720"/>
+        <w:jc w:val="both"/>
+        <w:rPr>
+          <w:rFonts w:ascii="Khmer OS Bokor" w:hAnsi="Khmer OS Bokor" w:cs="Khmer OS Bokor"/>
+          <w:sz w:val="24"/>
+          <w:szCs w:val="24"/>
+        </w:rPr>
+      </w:pPr>
+      <w:r>
+        <w:rPr>
+          <w:rFonts w:ascii="Khmer OS Bokor" w:hAnsi="Khmer OS Bokor" w:cs="Khmer OS Bokor" w:hint="cs"/>
+          <w:sz w:val="24"/>
+          <w:szCs w:val="24"/>
+          <w:cs/>
+        </w:rPr>
+        <w:t>២.១.៣ តួនាទី និងអត្ថប្រយោជន៏នៃប្រព័ន្ធគ្រប់គ្រង</w:t>
+      </w:r>
+    </w:p>
+    <w:p>
+      <w:pPr>
+        <w:tabs>
+          <w:tab w:val="left" w:pos="540"/>
+        </w:tabs>
+        <w:jc w:val="both"/>
+        <w:rPr>
+          <w:rFonts w:ascii="Khmer OS Bokor" w:hAnsi="Khmer OS Bokor" w:cs="Khmer OS Bokor"/>
+          <w:sz w:val="24"/>
+          <w:szCs w:val="24"/>
+        </w:rPr>
+      </w:pPr>
+      <w:r>
+        <w:rPr>
+          <w:rFonts w:ascii="Khmer OS Bokor" w:hAnsi="Khmer OS Bokor" w:cs="Khmer OS Bokor"/>
+          <w:sz w:val="24"/>
+          <w:szCs w:val="24"/>
+          <w:cs/>
+        </w:rPr>
+        <w:lastRenderedPageBreak/>
+        <w:tab/>
+      </w:r>
+      <w:r>
+        <w:rPr>
+          <w:rFonts w:ascii="Khmer OS Battambang" w:hAnsi="Khmer OS Battambang" w:cs="Khmer OS Battambang"/>
+          <w:sz w:val="24"/>
+          <w:szCs w:val="24"/>
+          <w:cs/>
+        </w:rPr>
+        <w:t>ប្រព័ន្ធគ្រប់គ្រងមានតួនាទីសំខាន់ក្នុងការជួយអង្គការកាត់បន្ថយការងារដោយដៃ បន្ថែមល្បឿនការងារ និងបង្កើនភាពត្រឹមត្រូវក្នុងការគ្រប់គ្រងទិន្នន័យ។ ប្រព័ន្ធនេះអាចជួយឱ្យអ្នកគ្រប់គ្រងតាមដានស្ថានភាពការងារ វាយតម្លៃលទ្ធផល និងធ្វើការសម្រេចចិត្តដោយផ្អែកលើទិន្នន័យពិតប្រាកដ។</w:t>
+      </w:r>
+    </w:p>
+    <w:p>
+      <w:pPr>
+        <w:tabs>
+          <w:tab w:val="left" w:pos="540"/>
+        </w:tabs>
+        <w:jc w:val="both"/>
+        <w:rPr>
+          <w:rFonts w:ascii="Khmer OS Battambang" w:hAnsi="Khmer OS Battambang" w:cs="Khmer OS Battambang"/>
+          <w:sz w:val="24"/>
+          <w:szCs w:val="24"/>
+        </w:rPr>
+      </w:pPr>
+      <w:r>
+        <w:rPr>
+          <w:rFonts w:ascii="Khmer OS Battambang" w:hAnsi="Khmer OS Battambang" w:cs="Khmer OS Battambang"/>
+          <w:sz w:val="24"/>
+          <w:szCs w:val="24"/>
+          <w:cs/>
+        </w:rPr>
+        <w:t>លើសពីនេះទៅទៀត ប្រព័ន្ធគ្រប់គ្រងជួយលើកកម្ពស់ភាពមានរបៀបរៀបរយ ការសម្របសម្រួលការងាររវាងផ្នែកផ្សេងៗ និងការប្រើប្រាស់ធនធានឱ្យមានប្រសិទ្ធភាពខ្ពស់។ ក្នុងសម័យឌីជីថល ប្រព័ន្ធគ្រប់គ្រងបានក្លាយជាឧបករណ៍សំខាន់មួយ សម្រាប់ការអភិវឌ្ឍ និងការរីកចម្រើនរបស់អង្គការ។</w:t>
+      </w:r>
+    </w:p>
+    <w:p>
+      <w:pPr>
+        <w:tabs>
+          <w:tab w:val="left" w:pos="540"/>
+        </w:tabs>
+        <w:jc w:val="both"/>
+        <w:rPr>
+          <w:rFonts w:ascii="Khmer OS Battambang" w:hAnsi="Khmer OS Battambang" w:cs="Khmer OS Battambang"/>
+          <w:sz w:val="24"/>
+          <w:szCs w:val="24"/>
+        </w:rPr>
+      </w:pPr>
+    </w:p>
+    <w:p>
+      <w:pPr>
+        <w:tabs>
+          <w:tab w:val="left" w:pos="540"/>
+        </w:tabs>
+        <w:jc w:val="both"/>
+        <w:rPr>
+          <w:rFonts w:ascii="Khmer OS Muol" w:hAnsi="Khmer OS Muol" w:cs="Khmer OS Muol"/>
+          <w:sz w:val="24"/>
+          <w:szCs w:val="24"/>
+        </w:rPr>
+      </w:pPr>
+      <w:r>
+        <w:rPr>
+          <w:rFonts w:ascii="Khmer OS Muol" w:hAnsi="Khmer OS Muol" w:cs="Khmer OS Muol" w:hint="cs"/>
+          <w:sz w:val="24"/>
+          <w:szCs w:val="24"/>
+          <w:cs/>
+        </w:rPr>
+        <w:t>២.២ ទស្សនៈទូទៅអំពីប្រព័ន្ធគ្រប់គ្រងកីឡា</w:t>
+      </w:r>
+    </w:p>
+    <w:p>
+      <w:pPr>
+        <w:tabs>
+          <w:tab w:val="left" w:pos="540"/>
+        </w:tabs>
+        <w:jc w:val="both"/>
+        <w:rPr>
+          <w:rFonts w:ascii="Khmer OS Battambang" w:hAnsi="Khmer OS Battambang" w:cs="Khmer OS Battambang"/>
+          <w:szCs w:val="24"/>
+        </w:rPr>
+      </w:pPr>
+      <w:r>
+        <w:rPr>
+          <w:rFonts w:ascii="Khmer OS Muol" w:hAnsi="Khmer OS Muol" w:cs="Khmer OS Muol"/>
+          <w:sz w:val="24"/>
+          <w:szCs w:val="24"/>
+          <w:cs/>
+        </w:rPr>
+        <w:tab/>
+      </w:r>
+      <w:r>
+        <w:rPr>
+          <w:rFonts w:ascii="Khmer OS Battambang" w:hAnsi="Khmer OS Battambang" w:cs="Khmer OS Battambang"/>
+          <w:szCs w:val="24"/>
+          <w:cs/>
+        </w:rPr>
+        <w:t>ប្រព័ន្ធគ្រប់គ្រងកីឡា (</w:t>
+      </w:r>
+      <w:r>
+        <w:rPr>
+          <w:rFonts w:ascii="Century" w:hAnsi="Century" w:cs="Khmer OS Battambang"/>
+          <w:sz w:val="24"/>
+          <w:szCs w:val="24"/>
+        </w:rPr>
+        <w:t>Sport Management System</w:t>
+      </w:r>
+      <w:r>
+        <w:rPr>
+          <w:rFonts w:ascii="Khmer OS Battambang" w:hAnsi="Khmer OS Battambang" w:cs="Khmer OS Battambang"/>
+          <w:szCs w:val="24"/>
+        </w:rPr>
+        <w:t xml:space="preserve">) </w:t>
+      </w:r>
+      <w:r>
+        <w:rPr>
+          <w:rFonts w:ascii="Khmer OS Battambang" w:hAnsi="Khmer OS Battambang" w:cs="Khmer OS Battambang"/>
+          <w:szCs w:val="24"/>
+          <w:cs/>
+        </w:rPr>
+        <w:t>គឺជាប្រព័ន្ធព័ត៌មានមួយ ដែលត្រូវបានបង្កើតឡើង ដើម្បីគ្រប់គ្រងសកម្មភាព និងធនធានពាក់ព័ន្ធនានា ក្នុងវិស័យកីឡា ឱ្យមានប្រសិទ្ធភាព និងមានរបៀបរៀបរយ។ ប្រព័ន្ធនេះមានតួនាទីសំខាន់ក្នុងការរៀបចំទិន្នន័យកីឡាករ គ្រូបង្វឹក កម្មវិធីហ្វឹកហាត់ ការប្រកួត ឧបករណ៍កីឡា និងលទ្ធផលនៃការប្រកួត។</w:t>
+      </w:r>
+    </w:p>
+    <w:p>
+      <w:pPr>
+        <w:tabs>
+          <w:tab w:val="left" w:pos="540"/>
+        </w:tabs>
+        <w:jc w:val="both"/>
+        <w:rPr>
+          <w:rFonts w:ascii="Khmer OS Battambang" w:hAnsi="Khmer OS Battambang" w:cs="Khmer OS Battambang"/>
+          <w:sz w:val="24"/>
+          <w:szCs w:val="24"/>
+        </w:rPr>
+      </w:pPr>
+      <w:r>
+        <w:rPr>
+          <w:rFonts w:ascii="Khmer OS Battambang" w:hAnsi="Khmer OS Battambang" w:cs="Khmer OS Battambang"/>
+          <w:sz w:val="24"/>
+          <w:szCs w:val="24"/>
+          <w:cs/>
+        </w:rPr>
+        <w:t>ក្នុងបរិបទសម័យទំនើប ការគ្រប់គ្រងកីឡាមិនអាចពឹងផ្អែកលើការកត់ត្រាបែបប្រពៃណីបានទៀតទេ ព្រោះវិស័យកីឡាមានការរីកចម្រើន និងស្មុគស្មាញកាន់តែខ្លាំង។ ដូច្នេះ ប្រព័ន្ធគ្រប់គ្រងកីឡាជាបច្ចេកវិទ្យាឌីជីថល ត្រូវបានអភិវឌ្ឍឡើង ដើម្បីជួយសម្រួលដល់ការងារគ្រប់គ្រង និងបង្កើនភាពត្រឹមត្រូវក្នុងការប្រើប្រាស់ព័ត៌មាន។</w:t>
+      </w:r>
+    </w:p>
+    <w:p>
+      <w:pPr>
+        <w:tabs>
+          <w:tab w:val="left" w:pos="540"/>
+        </w:tabs>
+        <w:jc w:val="both"/>
+        <w:rPr>
+          <w:rFonts w:ascii="Khmer OS Bokor" w:hAnsi="Khmer OS Bokor" w:cs="Khmer OS Bokor"/>
+          <w:sz w:val="24"/>
+          <w:szCs w:val="24"/>
+        </w:rPr>
+      </w:pPr>
+      <w:r>
+        <w:rPr>
+          <w:rFonts w:ascii="Khmer OS Battambang" w:hAnsi="Khmer OS Battambang" w:cs="Khmer OS Battambang"/>
+          <w:sz w:val="24"/>
+          <w:szCs w:val="24"/>
+        </w:rPr>
+        <w:tab/>
+      </w:r>
+      <w:r>
+        <w:rPr>
+          <w:rFonts w:ascii="Khmer OS Bokor" w:hAnsi="Khmer OS Bokor" w:cs="Khmer OS Bokor" w:hint="cs"/>
+          <w:sz w:val="24"/>
+          <w:szCs w:val="24"/>
+          <w:cs/>
+        </w:rPr>
+        <w:t>២.២.១ និយមន័យ និងគោលបំណងនៃប្រព័ន្ធគ្រប់គ្រងកីឡា</w:t>
+      </w:r>
+    </w:p>
+    <w:p>
+      <w:pPr>
+        <w:tabs>
+          <w:tab w:val="left" w:pos="540"/>
+        </w:tabs>
+        <w:jc w:val="both"/>
+        <w:rPr>
+          <w:rFonts w:ascii="Khmer OS Battambang" w:hAnsi="Khmer OS Battambang" w:cs="Khmer OS Battambang"/>
+          <w:sz w:val="24"/>
+          <w:szCs w:val="24"/>
+        </w:rPr>
+      </w:pPr>
+      <w:r>
+        <w:rPr>
+          <w:rFonts w:ascii="Khmer OS Battambang" w:hAnsi="Khmer OS Battambang" w:cs="Khmer OS Battambang"/>
+          <w:sz w:val="24"/>
+          <w:szCs w:val="24"/>
+          <w:cs/>
+        </w:rPr>
+        <w:tab/>
+      </w:r>
+      <w:r>
+        <w:rPr>
+          <w:rFonts w:ascii="Khmer OS Battambang" w:hAnsi="Khmer OS Battambang" w:cs="Khmer OS Battambang"/>
+          <w:sz w:val="24"/>
+          <w:szCs w:val="24"/>
+          <w:cs/>
+        </w:rPr>
+        <w:t>តាមទស្សនៈវិជ្ជាការ ប្រព័ន្ធគ្រប់គ្រងកីឡា ត្រូវបានកំណត់ថាជាប្រព័ន្ធមួយ ដែលរួមបញ្ចូលមនុស្ស ដំណើរការ និងបច្ចេកវិទ្យា ដើម្បីគ្រប់គ្រង និងគាំទ្រសកម្មភាពកីឡាទាំងមូល។ គោលបំណងសំខាន់នៃប្រព័ន្ធនេះ គឺដើម្បីធានាឱ្យការគ្រប់គ្រងកីឡាប្រព្រឹត្តទៅយ៉ាងមានប្រសិទ្ធភាព ត្រឹមត្រូវ និងមានភាពថ្លៃថ្នូរ។</w:t>
+      </w:r>
+    </w:p>
+    <w:p>
+      <w:pPr>
+        <w:tabs>
+          <w:tab w:val="left" w:pos="540"/>
+        </w:tabs>
+        <w:jc w:val="both"/>
+        <w:rPr>
+          <w:rFonts w:ascii="Khmer OS Battambang" w:hAnsi="Khmer OS Battambang" w:cs="Khmer OS Battambang"/>
+          <w:sz w:val="24"/>
+          <w:szCs w:val="24"/>
+        </w:rPr>
+      </w:pPr>
+      <w:r>
+        <w:rPr>
+          <w:rFonts w:ascii="Khmer OS Battambang" w:hAnsi="Khmer OS Battambang" w:cs="Khmer OS Battambang"/>
+          <w:sz w:val="24"/>
+          <w:szCs w:val="24"/>
+          <w:cs/>
+        </w:rPr>
+        <w:t>ប្រព័ន្ធគ្រប់គ្រងកីឡាមានគោលបំណងជួយកាត់បន្ថយការងារដោយដៃ សន្សំពេលវេលា និងបង្កើនសមត្ថភាពអ្នកគ្រប់គ្រង និងគ្រូបង្វឹក ក្នុងការតាមដាន និងវាយតម្លៃសកម្មភាពកីឡា។</w:t>
+      </w:r>
+    </w:p>
+    <w:p>
+      <w:pPr>
+        <w:tabs>
+          <w:tab w:val="left" w:pos="540"/>
+        </w:tabs>
+        <w:jc w:val="both"/>
+        <w:rPr>
+          <w:rFonts w:ascii="Khmer OS Bokor" w:hAnsi="Khmer OS Bokor" w:cs="Khmer OS Bokor"/>
+          <w:sz w:val="24"/>
+          <w:szCs w:val="24"/>
+        </w:rPr>
+      </w:pPr>
+      <w:r>
+        <w:rPr>
+          <w:rFonts w:ascii="Khmer OS Battambang" w:hAnsi="Khmer OS Battambang" w:cs="Khmer OS Battambang"/>
+          <w:sz w:val="24"/>
+          <w:szCs w:val="24"/>
+          <w:cs/>
+        </w:rPr>
+        <w:tab/>
+      </w:r>
+      <w:r>
+        <w:rPr>
+          <w:rFonts w:ascii="Khmer OS Bokor" w:hAnsi="Khmer OS Bokor" w:cs="Khmer OS Bokor" w:hint="cs"/>
+          <w:sz w:val="24"/>
+          <w:szCs w:val="24"/>
+          <w:cs/>
+        </w:rPr>
+        <w:t xml:space="preserve">២.២.២ </w:t>
+      </w:r>
+      <w:r>
+        <w:rPr>
+          <w:rFonts w:ascii="Khmer OS Bokor" w:hAnsi="Khmer OS Bokor" w:cs="Khmer OS Bokor" w:hint="cs"/>
+          <w:sz w:val="24"/>
+          <w:szCs w:val="24"/>
+          <w:cs/>
+        </w:rPr>
+        <w:t>ប្រភេទនៃប្រព័ន្ធគ្រប់គ្រងកីឡា</w:t>
+      </w:r>
+    </w:p>
+    <w:p>
+      <w:pPr>
+        <w:tabs>
+          <w:tab w:val="left" w:pos="540"/>
+        </w:tabs>
+        <w:jc w:val="both"/>
+        <w:rPr>
+          <w:rFonts w:ascii="Khmer OS Battambang" w:hAnsi="Khmer OS Battambang" w:cs="Khmer OS Battambang"/>
+          <w:szCs w:val="24"/>
+        </w:rPr>
+      </w:pPr>
+      <w:r>
+        <w:rPr>
+          <w:rFonts w:ascii="Khmer OS Bokor" w:hAnsi="Khmer OS Bokor" w:cs="Khmer OS Bokor"/>
+          <w:sz w:val="24"/>
+          <w:szCs w:val="24"/>
+          <w:cs/>
+        </w:rPr>
+        <w:tab/>
+      </w:r>
+      <w:r>
+        <w:rPr>
+          <w:rFonts w:ascii="Khmer OS Battambang" w:hAnsi="Khmer OS Battambang" w:cs="Khmer OS Battambang"/>
+          <w:szCs w:val="24"/>
+          <w:cs/>
+        </w:rPr>
+        <w:t>ប្រព័ន្ធគ្រប់គ្រងកីឡាអាចបែងចែកជាប្រភេទផ្សេងៗ អាស្រ័យលើបរិបទនៃការប្រើប្រាស់ ដូចជា៖</w:t>
+      </w:r>
+    </w:p>
+    <w:p>
+      <w:pPr>
+        <w:pStyle w:val="ListParagraph"/>
+        <w:numPr>
+          <w:ilvl w:val="0"/>
+          <w:numId w:val="7"/>
+        </w:numPr>
+        <w:tabs>
+          <w:tab w:val="left" w:pos="540"/>
+        </w:tabs>
+        <w:jc w:val="both"/>
+        <w:rPr>
+          <w:rFonts w:ascii="Khmer OS Battambang" w:hAnsi="Khmer OS Battambang" w:cs="Khmer OS Battambang"/>
+          <w:sz w:val="24"/>
+          <w:szCs w:val="24"/>
+        </w:rPr>
+      </w:pPr>
+      <w:r>
+        <w:rPr>
+          <w:rFonts w:ascii="Khmer OS Battambang" w:hAnsi="Khmer OS Battambang" w:cs="Khmer OS Battambang"/>
+          <w:sz w:val="24"/>
+          <w:szCs w:val="24"/>
+          <w:cs/>
+        </w:rPr>
+        <w:t>ប្រព័ន្ធគ្រប់គ្រងកីឡាក្នុងសាលា និងសាកលវិទ្យាល័យ</w:t>
+      </w:r>
+    </w:p>
+    <w:p>
+      <w:pPr>
+        <w:pStyle w:val="ListParagraph"/>
+        <w:numPr>
+          <w:ilvl w:val="0"/>
+          <w:numId w:val="7"/>
+        </w:numPr>
+        <w:tabs>
+          <w:tab w:val="left" w:pos="540"/>
+        </w:tabs>
+        <w:jc w:val="both"/>
+        <w:rPr>
+          <w:rFonts w:ascii="Khmer OS Battambang" w:hAnsi="Khmer OS Battambang" w:cs="Khmer OS Battambang"/>
+          <w:sz w:val="24"/>
+          <w:szCs w:val="24"/>
+        </w:rPr>
+      </w:pPr>
+      <w:r>
+        <w:rPr>
+          <w:rFonts w:ascii="Khmer OS Battambang" w:hAnsi="Khmer OS Battambang" w:cs="Khmer OS Battambang"/>
+          <w:sz w:val="24"/>
+          <w:szCs w:val="24"/>
+          <w:cs/>
+        </w:rPr>
+        <w:lastRenderedPageBreak/>
+        <w:t>ប្រព័ន្ធគ្រប់គ្រងកីឡានៅក្នុងអង្គការ ឬសមាគមកីឡា</w:t>
+      </w:r>
+    </w:p>
+    <w:p>
+      <w:pPr>
+        <w:pStyle w:val="ListParagraph"/>
+        <w:numPr>
+          <w:ilvl w:val="0"/>
+          <w:numId w:val="7"/>
+        </w:numPr>
+        <w:tabs>
+          <w:tab w:val="left" w:pos="540"/>
+        </w:tabs>
+        <w:jc w:val="both"/>
+        <w:rPr>
+          <w:rFonts w:ascii="Khmer OS Battambang" w:hAnsi="Khmer OS Battambang" w:cs="Khmer OS Battambang"/>
+          <w:sz w:val="24"/>
+          <w:szCs w:val="24"/>
+        </w:rPr>
+      </w:pPr>
+      <w:r>
+        <w:rPr>
+          <w:rFonts w:ascii="Khmer OS Battambang" w:hAnsi="Khmer OS Battambang" w:cs="Khmer OS Battambang"/>
+          <w:sz w:val="24"/>
+          <w:szCs w:val="24"/>
+          <w:cs/>
+        </w:rPr>
+        <w:t>ប្រព័ន្ធគ្រប់គ្រងកីឡាជំនាញ និងកីឡាអាជីព</w:t>
+      </w:r>
+    </w:p>
+    <w:p>
+      <w:pPr>
+        <w:tabs>
+          <w:tab w:val="left" w:pos="540"/>
+        </w:tabs>
+        <w:jc w:val="both"/>
+        <w:rPr>
+          <w:rFonts w:ascii="Khmer OS Battambang" w:hAnsi="Khmer OS Battambang" w:cs="Khmer OS Battambang"/>
+          <w:sz w:val="24"/>
+          <w:szCs w:val="24"/>
+        </w:rPr>
+      </w:pPr>
+      <w:r>
+        <w:rPr>
+          <w:rFonts w:ascii="Khmer OS Battambang" w:hAnsi="Khmer OS Battambang" w:cs="Khmer OS Battambang"/>
+          <w:sz w:val="24"/>
+          <w:szCs w:val="24"/>
+          <w:cs/>
+        </w:rPr>
+        <w:t>ប្រភេទទាំងនេះមានលក្ខណៈខុសគ្នាទៅតាមគោលដៅ ប៉ុន្តែសុទ្ធសឹងមានគោលបំណងរួមគ្នា គឺការគ្រប់គ្រងសកម្មភាពកីឡាឱ្យមានប្រសិទ្ធភាព និងមានប្រព័ន្ធ។</w:t>
+      </w:r>
+    </w:p>
+    <w:p>
+      <w:pPr>
+        <w:tabs>
+          <w:tab w:val="left" w:pos="540"/>
+        </w:tabs>
+        <w:jc w:val="both"/>
+        <w:rPr>
+          <w:rFonts w:ascii="Khmer OS Bokor" w:hAnsi="Khmer OS Bokor" w:cs="Khmer OS Bokor"/>
+          <w:sz w:val="24"/>
+          <w:szCs w:val="24"/>
+        </w:rPr>
+      </w:pPr>
+      <w:r>
+        <w:rPr>
+          <w:rFonts w:ascii="Khmer OS Battambang" w:hAnsi="Khmer OS Battambang" w:cs="Khmer OS Battambang"/>
+          <w:sz w:val="24"/>
+          <w:szCs w:val="24"/>
+          <w:cs/>
+        </w:rPr>
+        <w:tab/>
+      </w:r>
+      <w:r>
+        <w:rPr>
+          <w:rFonts w:ascii="Khmer OS Bokor" w:hAnsi="Khmer OS Bokor" w:cs="Khmer OS Bokor" w:hint="cs"/>
+          <w:sz w:val="24"/>
+          <w:szCs w:val="24"/>
+          <w:cs/>
+        </w:rPr>
+        <w:t>២.២.៣ អ្នកពាក់ព័ន្ធក្នុងប្រព័ន្ធគ្រប់គ្រងកីឡា</w:t>
+      </w:r>
+    </w:p>
+    <w:p>
+      <w:pPr>
+        <w:tabs>
+          <w:tab w:val="left" w:pos="540"/>
+        </w:tabs>
+        <w:jc w:val="both"/>
+        <w:rPr>
+          <w:rFonts w:ascii="Khmer OS Battambang" w:hAnsi="Khmer OS Battambang" w:cs="Khmer OS Battambang"/>
+          <w:sz w:val="24"/>
+          <w:szCs w:val="24"/>
+        </w:rPr>
+      </w:pPr>
+      <w:r>
+        <w:rPr>
+          <w:rFonts w:ascii="Khmer OS Battambang" w:hAnsi="Khmer OS Battambang" w:cs="Khmer OS Battambang"/>
+          <w:sz w:val="24"/>
+          <w:szCs w:val="24"/>
+          <w:cs/>
+        </w:rPr>
+        <w:tab/>
+      </w:r>
+      <w:r>
+        <w:rPr>
+          <w:rFonts w:ascii="Khmer OS Battambang" w:hAnsi="Khmer OS Battambang" w:cs="Khmer OS Battambang"/>
+          <w:sz w:val="24"/>
+          <w:szCs w:val="24"/>
+          <w:cs/>
+        </w:rPr>
+        <w:t>ប្រព័ន្ធគ្រប់គ្រងកីឡាមានអ្នកពាក់ព័ន្ធជាចម្បង ដូចជា អ្នកគ្រប់គ្រង គ្រូបង្វឹក និងកីឡាករ។ អ្នកគ្រប់គ្រងមានតួនាទីក្នុងការរៀបចំផែនការ និងធ្វើការសម្រេចចិត្ត។ គ្រូបង្វឹកមានតួនាទីក្នុងការគ្រប់គ្រងការហ្វឹកហាត់ និងវាយតម្លៃសមត្ថភាពកីឡាករ ខណៈដែលកីឡាករជាអ្នកទទួលផលផ្ទាល់ពីប្រព័ន្ធ។</w:t>
+      </w:r>
+    </w:p>
+    <w:p>
+      <w:pPr>
+        <w:tabs>
+          <w:tab w:val="left" w:pos="540"/>
+        </w:tabs>
+        <w:jc w:val="both"/>
+        <w:rPr>
+          <w:rFonts w:ascii="Khmer OS Battambang" w:hAnsi="Khmer OS Battambang" w:cs="Khmer OS Battambang"/>
+          <w:sz w:val="24"/>
+          <w:szCs w:val="24"/>
+        </w:rPr>
+      </w:pPr>
+      <w:r>
+        <w:rPr>
+          <w:rFonts w:ascii="Khmer OS Battambang" w:hAnsi="Khmer OS Battambang" w:cs="Khmer OS Battambang"/>
+          <w:sz w:val="24"/>
+          <w:szCs w:val="24"/>
+          <w:cs/>
+        </w:rPr>
+        <w:t>ការសហការរវាងអ្នកពាក់ព័ន្ធទាំងនេះ គឺជាចំណុចសំខាន់ដែលធ្វើឱ្យប្រព័ន្ធគ្រប់គ្រងកីឡាដំណើរការបានយ៉ាងមានប្រសិទ្ធភាព។</w:t>
+      </w:r>
+    </w:p>
+    <w:p>
+      <w:pPr>
+        <w:tabs>
+          <w:tab w:val="left" w:pos="540"/>
+        </w:tabs>
+        <w:jc w:val="both"/>
+        <w:rPr>
+          <w:rFonts w:ascii="Khmer OS Bokor" w:hAnsi="Khmer OS Bokor" w:cs="Khmer OS Bokor"/>
+          <w:sz w:val="24"/>
+          <w:szCs w:val="24"/>
+        </w:rPr>
+      </w:pPr>
+      <w:r>
+        <w:rPr>
+          <w:rFonts w:ascii="Khmer OS Battambang" w:hAnsi="Khmer OS Battambang" w:cs="Khmer OS Battambang"/>
+          <w:sz w:val="24"/>
+          <w:szCs w:val="24"/>
+          <w:cs/>
+        </w:rPr>
+        <w:tab/>
+      </w:r>
+      <w:r>
+        <w:rPr>
+          <w:rFonts w:ascii="Khmer OS Bokor" w:hAnsi="Khmer OS Bokor" w:cs="Khmer OS Bokor" w:hint="cs"/>
+          <w:sz w:val="24"/>
+          <w:szCs w:val="24"/>
+          <w:cs/>
+        </w:rPr>
+        <w:t>២.២.៤ តួនាទី និងអត្ថប្រយោជន៏ប្រព័ន្ធគ្រប់គ្រងកីឡា</w:t>
+      </w:r>
+    </w:p>
+    <w:p>
+      <w:pPr>
+        <w:tabs>
+          <w:tab w:val="left" w:pos="540"/>
+        </w:tabs>
+        <w:jc w:val="both"/>
+        <w:rPr>
+          <w:rFonts w:ascii="Khmer OS Battambang" w:hAnsi="Khmer OS Battambang" w:cs="Khmer OS Battambang"/>
+          <w:sz w:val="24"/>
+          <w:szCs w:val="24"/>
+        </w:rPr>
+      </w:pPr>
+      <w:r>
+        <w:rPr>
+          <w:rFonts w:ascii="Khmer OS Battambang" w:hAnsi="Khmer OS Battambang" w:cs="Khmer OS Battambang"/>
+          <w:sz w:val="24"/>
+          <w:szCs w:val="24"/>
+          <w:cs/>
+        </w:rPr>
+        <w:tab/>
+      </w:r>
+      <w:r>
+        <w:rPr>
+          <w:rFonts w:ascii="Khmer OS Battambang" w:hAnsi="Khmer OS Battambang" w:cs="Khmer OS Battambang"/>
+          <w:sz w:val="24"/>
+          <w:szCs w:val="24"/>
+          <w:cs/>
+        </w:rPr>
+        <w:t>ប្រព័ន្ធគ្រប់គ្រងកីឡាមានតួនាទីសំខាន់ក្នុងការបង្កើនប្រសិទ្ធភាពការងារ កាត់បន្ថយកំហុស និងបង្កើនភាពត្រឹមត្រូវក្នុងការគ្រប់គ្រងទិន្នន័យកីឡា។ វាជួយឱ្យការរៀបចំសកម្មភាពកីឡាមានភាពច្បាស់លាស់ និងងាយស្រួលតាមដាន។</w:t>
+      </w:r>
+    </w:p>
+    <w:p>
+      <w:pPr>
+        <w:tabs>
+          <w:tab w:val="left" w:pos="540"/>
+        </w:tabs>
+        <w:jc w:val="both"/>
+        <w:rPr>
+          <w:rFonts w:ascii="Khmer OS Battambang" w:hAnsi="Khmer OS Battambang" w:cs="Khmer OS Battambang"/>
+          <w:sz w:val="24"/>
+          <w:szCs w:val="24"/>
+        </w:rPr>
+      </w:pPr>
+      <w:r>
+        <w:rPr>
+          <w:rFonts w:ascii="Khmer OS Battambang" w:hAnsi="Khmer OS Battambang" w:cs="Khmer OS Battambang"/>
+          <w:sz w:val="24"/>
+          <w:szCs w:val="24"/>
+          <w:cs/>
+        </w:rPr>
+        <w:t>លើសពីនេះទៅទៀត ប្រព័ន្ធគ្រប់គ្រងកីឡាជួយគាំទ្រដល់ការសម្រេចចិត្តរបស់អ្នកគ្រប់គ្រង និងជួយលើកកម្ពស់គុណភាពការបង្វឹក និងការអភិវឌ្ឍសមត្ថភាពកីឡាករ។ ប្រព័ន្ធនេះក៏មានតួនាទីសំខាន់ក្នុងការអភិវឌ្ឍវិស័យកីឡាឱ្យមានភាពទាន់សម័យ និងមានស្តង់ដារ។</w:t>
+      </w:r>
+    </w:p>
+    <w:p>
+      <w:pPr>
+        <w:tabs>
+          <w:tab w:val="left" w:pos="540"/>
+        </w:tabs>
+        <w:jc w:val="both"/>
+        <w:rPr>
+          <w:rFonts w:ascii="Khmer OS Battambang" w:hAnsi="Khmer OS Battambang" w:cs="Khmer OS Battambang"/>
+          <w:sz w:val="24"/>
+          <w:szCs w:val="24"/>
+        </w:rPr>
+      </w:pPr>
+    </w:p>
+    <w:p>
+      <w:pPr>
+        <w:tabs>
+          <w:tab w:val="left" w:pos="540"/>
+        </w:tabs>
+        <w:jc w:val="both"/>
+        <w:rPr>
+          <w:rFonts w:ascii="Khmer OS Battambang" w:hAnsi="Khmer OS Battambang" w:cs="Khmer OS Battambang"/>
+          <w:sz w:val="24"/>
+          <w:szCs w:val="24"/>
+        </w:rPr>
+      </w:pPr>
+    </w:p>
+    <w:p>
+      <w:pPr>
+        <w:tabs>
+          <w:tab w:val="left" w:pos="540"/>
+        </w:tabs>
+        <w:jc w:val="both"/>
+        <w:rPr>
+          <w:rFonts w:ascii="Khmer OS Bokor" w:hAnsi="Khmer OS Bokor" w:cs="Khmer OS Bokor"/>
+          <w:sz w:val="24"/>
+          <w:szCs w:val="24"/>
+        </w:rPr>
+      </w:pPr>
+    </w:p>
+    <w:p>
+      <w:pPr>
+        <w:tabs>
+          <w:tab w:val="left" w:pos="540"/>
+        </w:tabs>
+        <w:jc w:val="both"/>
+        <w:rPr>
+          <w:rFonts w:ascii="Khmer OS Battambang" w:hAnsi="Khmer OS Battambang" w:cs="Khmer OS Battambang"/>
+          <w:sz w:val="24"/>
+          <w:szCs w:val="24"/>
+          <w:cs/>
+        </w:rPr>
+      </w:pPr>
+      <w:r>
+        <w:rPr>
+          <w:rFonts w:ascii="Khmer OS Battambang" w:hAnsi="Khmer OS Battambang" w:cs="Khmer OS Battambang"/>
+          <w:sz w:val="24"/>
+          <w:szCs w:val="24"/>
+          <w:cs/>
+        </w:rPr>
+        <w:br w:type="page"/>
+      </w:r>
+    </w:p>
+    <w:p>
+      <w:pPr>
+        <w:tabs>
+          <w:tab w:val="left" w:pos="540"/>
+        </w:tabs>
+        <w:jc w:val="both"/>
+        <w:rPr>
+          <w:rFonts w:ascii="Khmer OS Battambang" w:hAnsi="Khmer OS Battambang" w:cs="Khmer OS Battambang"/>
+          <w:sz w:val="24"/>
+          <w:szCs w:val="24"/>
+          <w:cs/>
+        </w:rPr>
+      </w:pPr>
+      <w:r>
+        <w:rPr>
+          <w:rFonts w:ascii="Khmer OS Battambang" w:hAnsi="Khmer OS Battambang" w:cs="Khmer OS Battambang"/>
+          <w:sz w:val="24"/>
+          <w:szCs w:val="24"/>
+          <w:cs/>
+        </w:rPr>
+        <w:lastRenderedPageBreak/>
+        <w:br w:type="page"/>
+      </w:r>
+    </w:p>
+    <w:p>
+      <w:pPr>
+        <w:tabs>
+          <w:tab w:val="left" w:pos="540"/>
+        </w:tabs>
+        <w:jc w:val="both"/>
         <w:rPr>
           <w:rFonts w:ascii="Khmer OS Battambang" w:hAnsi="Khmer OS Battambang" w:cs="Khmer OS Battambang"/>
           <w:sz w:val="24"/>
@@ -6470,7 +7587,7 @@
     <w:pPr>
       <w:pStyle w:val="Footer"/>
       <w:rPr>
-        <w:rFonts w:ascii="Cambria" w:hAnsi="Cambria" w:cs="Khmer OS Battambang" w:hint="cs"/>
+        <w:rFonts w:ascii="Cambria" w:hAnsi="Cambria" w:cs="Khmer OS Battambang"/>
         <w:noProof/>
         <w:cs/>
       </w:rPr>
@@ -6512,7 +7629,15 @@
             <w:szCs w:val="22"/>
             <w:cs/>
           </w:rPr>
-          <w:t xml:space="preserve"> បច្ចេកវិទ្យាព័ត៌មាន</w:t>
+          <w:t xml:space="preserve"> </w:t>
+        </w:r>
+        <w:r>
+          <w:rPr>
+            <w:rFonts w:ascii="Khmer OS Battambang" w:hAnsi="Khmer OS Battambang" w:cs="Khmer OS Battambang"/>
+            <w:szCs w:val="22"/>
+            <w:cs/>
+          </w:rPr>
+          <w:t>បច្ចេកវិទ្យាព័ត៌មាន</w:t>
         </w:r>
         <w:r>
           <w:tab/>
@@ -6620,7 +7745,6 @@
         <w:tab w:val="clear" w:pos="4680"/>
       </w:tabs>
       <w:rPr>
-        <w:rFonts w:hint="cs"/>
         <w:b/>
         <w:bCs/>
         <w:cs/>
@@ -6684,6 +7808,417 @@
 <file path=word/numbering.xml><?xml version="1.0" encoding="utf-8"?>
 <w:numbering xmlns:wpc="http://schemas.microsoft.com/office/word/2010/wordprocessingCanvas" xmlns:cx="http://schemas.microsoft.com/office/drawing/2014/chartex" xmlns:cx1="http://schemas.microsoft.com/office/drawing/2015/9/8/chartex" xmlns:cx2="http://schemas.microsoft.com/office/drawing/2015/10/21/chartex" xmlns:cx3="http://schemas.microsoft.com/office/drawing/2016/5/9/chartex" xmlns:cx4="http://schemas.microsoft.com/office/drawing/2016/5/10/chartex" xmlns:cx5="http://schemas.microsoft.com/office/drawing/2016/5/11/chartex" xmlns:cx6="http://schemas.microsoft.com/office/drawing/2016/5/12/chartex" xmlns:cx7="http://schemas.microsoft.com/office/drawing/2016/5/13/chartex" xmlns:cx8="http://schemas.microsoft.com/office/drawing/2016/5/14/chartex" xmlns:mc="http://schemas.openxmlformats.org/markup-compatibility/2006" xmlns:aink="http://schemas.microsoft.com/office/drawing/2016/ink" xmlns:am3d="http://schemas.microsoft.com/office/drawing/2017/model3d" xmlns:o="urn:schemas-microsoft-com:office:office" xmlns:oel="http://schemas.microsoft.com/office/2019/extlst" xmlns:r="http://schemas.openxmlformats.org/officeDocument/2006/relationships" xmlns:m="http://schemas.openxmlformats.org/officeDocument/2006/math" xmlns:v="urn:schemas-microsoft-com:vml" xmlns:wp14="http://schemas.microsoft.com/office/word/2010/wordprocessingDrawing" xmlns:wp="http://schemas.openxmlformats.org/drawingml/2006/wordprocessingDrawing" xmlns:w10="urn:schemas-microsoft-com:office:word" xmlns:w="http://schemas.openxmlformats.org/wordprocessingml/2006/main" xmlns:w14="http://schemas.microsoft.com/office/word/2010/wordml" xmlns:w15="http://schemas.microsoft.com/office/word/2012/wordml" xmlns:w16cex="http://schemas.microsoft.com/office/word/2018/wordml/cex" xmlns:w16cid="http://schemas.microsoft.com/office/word/2016/wordml/cid" xmlns:w16="http://schemas.microsoft.com/office/word/2018/wordml" xmlns:w16du="http://schemas.microsoft.com/office/word/2023/wordml/word16du" xmlns:w16sdtdh="http://schemas.microsoft.com/office/word/2020/wordml/sdtdatahash" xmlns:w16sdtfl="http://schemas.microsoft.com/office/word/2024/wordml/sdtformatlock" xmlns:w16se="http://schemas.microsoft.com/office/word/2015/wordml/symex" xmlns:wpg="http://schemas.microsoft.com/office/word/2010/wordprocessingGroup" xmlns:wpi="http://schemas.microsoft.com/office/word/2010/wordprocessingInk" xmlns:wne="http://schemas.microsoft.com/office/word/2006/wordml" xmlns:wps="http://schemas.microsoft.com/office/word/2010/wordprocessingShape" mc:Ignorable="w14 w15 w16se w16cid w16 w16cex w16sdtdh w16sdtfl w16du wp14">
   <w:abstractNum w:abstractNumId="0" w15:restartNumberingAfterBreak="0">
+    <w:nsid w:val="084029BB"/>
+    <w:multiLevelType w:val="multilevel"/>
+    <w:tmpl w:val="4B8C9666"/>
+    <w:lvl w:ilvl="0">
+      <w:start w:val="1"/>
+      <w:numFmt w:val="bullet"/>
+      <w:lvlText w:val=""/>
+      <w:lvlJc w:val="left"/>
+      <w:pPr>
+        <w:tabs>
+          <w:tab w:val="num" w:pos="720"/>
+        </w:tabs>
+        <w:ind w:left="720" w:hanging="360"/>
+      </w:pPr>
+      <w:rPr>
+        <w:rFonts w:ascii="Symbol" w:hAnsi="Symbol" w:hint="default"/>
+        <w:sz w:val="20"/>
+      </w:rPr>
+    </w:lvl>
+    <w:lvl w:ilvl="1" w:tentative="1">
+      <w:start w:val="1"/>
+      <w:numFmt w:val="bullet"/>
+      <w:lvlText w:val="o"/>
+      <w:lvlJc w:val="left"/>
+      <w:pPr>
+        <w:tabs>
+          <w:tab w:val="num" w:pos="1440"/>
+        </w:tabs>
+        <w:ind w:left="1440" w:hanging="360"/>
+      </w:pPr>
+      <w:rPr>
+        <w:rFonts w:ascii="Courier New" w:hAnsi="Courier New" w:hint="default"/>
+        <w:sz w:val="20"/>
+      </w:rPr>
+    </w:lvl>
+    <w:lvl w:ilvl="2" w:tentative="1">
+      <w:start w:val="1"/>
+      <w:numFmt w:val="bullet"/>
+      <w:lvlText w:val=""/>
+      <w:lvlJc w:val="left"/>
+      <w:pPr>
+        <w:tabs>
+          <w:tab w:val="num" w:pos="2160"/>
+        </w:tabs>
+        <w:ind w:left="2160" w:hanging="360"/>
+      </w:pPr>
+      <w:rPr>
+        <w:rFonts w:ascii="Wingdings" w:hAnsi="Wingdings" w:hint="default"/>
+        <w:sz w:val="20"/>
+      </w:rPr>
+    </w:lvl>
+    <w:lvl w:ilvl="3" w:tentative="1">
+      <w:start w:val="1"/>
+      <w:numFmt w:val="bullet"/>
+      <w:lvlText w:val=""/>
+      <w:lvlJc w:val="left"/>
+      <w:pPr>
+        <w:tabs>
+          <w:tab w:val="num" w:pos="2880"/>
+        </w:tabs>
+        <w:ind w:left="2880" w:hanging="360"/>
+      </w:pPr>
+      <w:rPr>
+        <w:rFonts w:ascii="Wingdings" w:hAnsi="Wingdings" w:hint="default"/>
+        <w:sz w:val="20"/>
+      </w:rPr>
+    </w:lvl>
+    <w:lvl w:ilvl="4" w:tentative="1">
+      <w:start w:val="1"/>
+      <w:numFmt w:val="bullet"/>
+      <w:lvlText w:val=""/>
+      <w:lvlJc w:val="left"/>
+      <w:pPr>
+        <w:tabs>
+          <w:tab w:val="num" w:pos="3600"/>
+        </w:tabs>
+        <w:ind w:left="3600" w:hanging="360"/>
+      </w:pPr>
+      <w:rPr>
+        <w:rFonts w:ascii="Wingdings" w:hAnsi="Wingdings" w:hint="default"/>
+        <w:sz w:val="20"/>
+      </w:rPr>
+    </w:lvl>
+    <w:lvl w:ilvl="5" w:tentative="1">
+      <w:start w:val="1"/>
+      <w:numFmt w:val="bullet"/>
+      <w:lvlText w:val=""/>
+      <w:lvlJc w:val="left"/>
+      <w:pPr>
+        <w:tabs>
+          <w:tab w:val="num" w:pos="4320"/>
+        </w:tabs>
+        <w:ind w:left="4320" w:hanging="360"/>
+      </w:pPr>
+      <w:rPr>
+        <w:rFonts w:ascii="Wingdings" w:hAnsi="Wingdings" w:hint="default"/>
+        <w:sz w:val="20"/>
+      </w:rPr>
+    </w:lvl>
+    <w:lvl w:ilvl="6" w:tentative="1">
+      <w:start w:val="1"/>
+      <w:numFmt w:val="bullet"/>
+      <w:lvlText w:val=""/>
+      <w:lvlJc w:val="left"/>
+      <w:pPr>
+        <w:tabs>
+          <w:tab w:val="num" w:pos="5040"/>
+        </w:tabs>
+        <w:ind w:left="5040" w:hanging="360"/>
+      </w:pPr>
+      <w:rPr>
+        <w:rFonts w:ascii="Wingdings" w:hAnsi="Wingdings" w:hint="default"/>
+        <w:sz w:val="20"/>
+      </w:rPr>
+    </w:lvl>
+    <w:lvl w:ilvl="7" w:tentative="1">
+      <w:start w:val="1"/>
+      <w:numFmt w:val="bullet"/>
+      <w:lvlText w:val=""/>
+      <w:lvlJc w:val="left"/>
+      <w:pPr>
+        <w:tabs>
+          <w:tab w:val="num" w:pos="5760"/>
+        </w:tabs>
+        <w:ind w:left="5760" w:hanging="360"/>
+      </w:pPr>
+      <w:rPr>
+        <w:rFonts w:ascii="Wingdings" w:hAnsi="Wingdings" w:hint="default"/>
+        <w:sz w:val="20"/>
+      </w:rPr>
+    </w:lvl>
+    <w:lvl w:ilvl="8" w:tentative="1">
+      <w:start w:val="1"/>
+      <w:numFmt w:val="bullet"/>
+      <w:lvlText w:val=""/>
+      <w:lvlJc w:val="left"/>
+      <w:pPr>
+        <w:tabs>
+          <w:tab w:val="num" w:pos="6480"/>
+        </w:tabs>
+        <w:ind w:left="6480" w:hanging="360"/>
+      </w:pPr>
+      <w:rPr>
+        <w:rFonts w:ascii="Wingdings" w:hAnsi="Wingdings" w:hint="default"/>
+        <w:sz w:val="20"/>
+      </w:rPr>
+    </w:lvl>
+  </w:abstractNum>
+  <w:abstractNum w:abstractNumId="1" w15:restartNumberingAfterBreak="0">
+    <w:nsid w:val="11FB04C4"/>
+    <w:multiLevelType w:val="hybridMultilevel"/>
+    <w:tmpl w:val="CE02B6DE"/>
+    <w:lvl w:ilvl="0" w:tplc="04090001">
+      <w:start w:val="1"/>
+      <w:numFmt w:val="bullet"/>
+      <w:lvlText w:val=""/>
+      <w:lvlJc w:val="left"/>
+      <w:pPr>
+        <w:ind w:left="1080" w:hanging="360"/>
+      </w:pPr>
+      <w:rPr>
+        <w:rFonts w:ascii="Symbol" w:hAnsi="Symbol" w:hint="default"/>
+      </w:rPr>
+    </w:lvl>
+    <w:lvl w:ilvl="1" w:tplc="FFFFFFFF" w:tentative="1">
+      <w:start w:val="1"/>
+      <w:numFmt w:val="bullet"/>
+      <w:lvlText w:val="o"/>
+      <w:lvlJc w:val="left"/>
+      <w:pPr>
+        <w:ind w:left="1800" w:hanging="360"/>
+      </w:pPr>
+      <w:rPr>
+        <w:rFonts w:ascii="Courier New" w:hAnsi="Courier New" w:cs="Courier New" w:hint="default"/>
+      </w:rPr>
+    </w:lvl>
+    <w:lvl w:ilvl="2" w:tplc="FFFFFFFF" w:tentative="1">
+      <w:start w:val="1"/>
+      <w:numFmt w:val="bullet"/>
+      <w:lvlText w:val=""/>
+      <w:lvlJc w:val="left"/>
+      <w:pPr>
+        <w:ind w:left="2520" w:hanging="360"/>
+      </w:pPr>
+      <w:rPr>
+        <w:rFonts w:ascii="Wingdings" w:hAnsi="Wingdings" w:hint="default"/>
+      </w:rPr>
+    </w:lvl>
+    <w:lvl w:ilvl="3" w:tplc="FFFFFFFF" w:tentative="1">
+      <w:start w:val="1"/>
+      <w:numFmt w:val="bullet"/>
+      <w:lvlText w:val=""/>
+      <w:lvlJc w:val="left"/>
+      <w:pPr>
+        <w:ind w:left="3240" w:hanging="360"/>
+      </w:pPr>
+      <w:rPr>
+        <w:rFonts w:ascii="Symbol" w:hAnsi="Symbol" w:hint="default"/>
+      </w:rPr>
+    </w:lvl>
+    <w:lvl w:ilvl="4" w:tplc="FFFFFFFF" w:tentative="1">
+      <w:start w:val="1"/>
+      <w:numFmt w:val="bullet"/>
+      <w:lvlText w:val="o"/>
+      <w:lvlJc w:val="left"/>
+      <w:pPr>
+        <w:ind w:left="3960" w:hanging="360"/>
+      </w:pPr>
+      <w:rPr>
+        <w:rFonts w:ascii="Courier New" w:hAnsi="Courier New" w:cs="Courier New" w:hint="default"/>
+      </w:rPr>
+    </w:lvl>
+    <w:lvl w:ilvl="5" w:tplc="FFFFFFFF" w:tentative="1">
+      <w:start w:val="1"/>
+      <w:numFmt w:val="bullet"/>
+      <w:lvlText w:val=""/>
+      <w:lvlJc w:val="left"/>
+      <w:pPr>
+        <w:ind w:left="4680" w:hanging="360"/>
+      </w:pPr>
+      <w:rPr>
+        <w:rFonts w:ascii="Wingdings" w:hAnsi="Wingdings" w:hint="default"/>
+      </w:rPr>
+    </w:lvl>
+    <w:lvl w:ilvl="6" w:tplc="FFFFFFFF" w:tentative="1">
+      <w:start w:val="1"/>
+      <w:numFmt w:val="bullet"/>
+      <w:lvlText w:val=""/>
+      <w:lvlJc w:val="left"/>
+      <w:pPr>
+        <w:ind w:left="5400" w:hanging="360"/>
+      </w:pPr>
+      <w:rPr>
+        <w:rFonts w:ascii="Symbol" w:hAnsi="Symbol" w:hint="default"/>
+      </w:rPr>
+    </w:lvl>
+    <w:lvl w:ilvl="7" w:tplc="FFFFFFFF" w:tentative="1">
+      <w:start w:val="1"/>
+      <w:numFmt w:val="bullet"/>
+      <w:lvlText w:val="o"/>
+      <w:lvlJc w:val="left"/>
+      <w:pPr>
+        <w:ind w:left="6120" w:hanging="360"/>
+      </w:pPr>
+      <w:rPr>
+        <w:rFonts w:ascii="Courier New" w:hAnsi="Courier New" w:cs="Courier New" w:hint="default"/>
+      </w:rPr>
+    </w:lvl>
+    <w:lvl w:ilvl="8" w:tplc="FFFFFFFF" w:tentative="1">
+      <w:start w:val="1"/>
+      <w:numFmt w:val="bullet"/>
+      <w:lvlText w:val=""/>
+      <w:lvlJc w:val="left"/>
+      <w:pPr>
+        <w:ind w:left="6840" w:hanging="360"/>
+      </w:pPr>
+      <w:rPr>
+        <w:rFonts w:ascii="Wingdings" w:hAnsi="Wingdings" w:hint="default"/>
+      </w:rPr>
+    </w:lvl>
+  </w:abstractNum>
+  <w:abstractNum w:abstractNumId="2" w15:restartNumberingAfterBreak="0">
+    <w:nsid w:val="33063DC5"/>
+    <w:multiLevelType w:val="multilevel"/>
+    <w:tmpl w:val="EEC476D8"/>
+    <w:lvl w:ilvl="0">
+      <w:start w:val="1"/>
+      <w:numFmt w:val="bullet"/>
+      <w:lvlText w:val=""/>
+      <w:lvlJc w:val="left"/>
+      <w:pPr>
+        <w:tabs>
+          <w:tab w:val="num" w:pos="720"/>
+        </w:tabs>
+        <w:ind w:left="720" w:hanging="360"/>
+      </w:pPr>
+      <w:rPr>
+        <w:rFonts w:ascii="Symbol" w:hAnsi="Symbol" w:hint="default"/>
+        <w:sz w:val="20"/>
+      </w:rPr>
+    </w:lvl>
+    <w:lvl w:ilvl="1" w:tentative="1">
+      <w:start w:val="1"/>
+      <w:numFmt w:val="bullet"/>
+      <w:lvlText w:val="o"/>
+      <w:lvlJc w:val="left"/>
+      <w:pPr>
+        <w:tabs>
+          <w:tab w:val="num" w:pos="1440"/>
+        </w:tabs>
+        <w:ind w:left="1440" w:hanging="360"/>
+      </w:pPr>
+      <w:rPr>
+        <w:rFonts w:ascii="Courier New" w:hAnsi="Courier New" w:hint="default"/>
+        <w:sz w:val="20"/>
+      </w:rPr>
+    </w:lvl>
+    <w:lvl w:ilvl="2" w:tentative="1">
+      <w:start w:val="1"/>
+      <w:numFmt w:val="bullet"/>
+      <w:lvlText w:val=""/>
+      <w:lvlJc w:val="left"/>
+      <w:pPr>
+        <w:tabs>
+          <w:tab w:val="num" w:pos="2160"/>
+        </w:tabs>
+        <w:ind w:left="2160" w:hanging="360"/>
+      </w:pPr>
+      <w:rPr>
+        <w:rFonts w:ascii="Wingdings" w:hAnsi="Wingdings" w:hint="default"/>
+        <w:sz w:val="20"/>
+      </w:rPr>
+    </w:lvl>
+    <w:lvl w:ilvl="3" w:tentative="1">
+      <w:start w:val="1"/>
+      <w:numFmt w:val="bullet"/>
+      <w:lvlText w:val=""/>
+      <w:lvlJc w:val="left"/>
+      <w:pPr>
+        <w:tabs>
+          <w:tab w:val="num" w:pos="2880"/>
+        </w:tabs>
+        <w:ind w:left="2880" w:hanging="360"/>
+      </w:pPr>
+      <w:rPr>
+        <w:rFonts w:ascii="Wingdings" w:hAnsi="Wingdings" w:hint="default"/>
+        <w:sz w:val="20"/>
+      </w:rPr>
+    </w:lvl>
+    <w:lvl w:ilvl="4" w:tentative="1">
+      <w:start w:val="1"/>
+      <w:numFmt w:val="bullet"/>
+      <w:lvlText w:val=""/>
+      <w:lvlJc w:val="left"/>
+      <w:pPr>
+        <w:tabs>
+          <w:tab w:val="num" w:pos="3600"/>
+        </w:tabs>
+        <w:ind w:left="3600" w:hanging="360"/>
+      </w:pPr>
+      <w:rPr>
+        <w:rFonts w:ascii="Wingdings" w:hAnsi="Wingdings" w:hint="default"/>
+        <w:sz w:val="20"/>
+      </w:rPr>
+    </w:lvl>
+    <w:lvl w:ilvl="5" w:tentative="1">
+      <w:start w:val="1"/>
+      <w:numFmt w:val="bullet"/>
+      <w:lvlText w:val=""/>
+      <w:lvlJc w:val="left"/>
+      <w:pPr>
+        <w:tabs>
+          <w:tab w:val="num" w:pos="4320"/>
+        </w:tabs>
+        <w:ind w:left="4320" w:hanging="360"/>
+      </w:pPr>
+      <w:rPr>
+        <w:rFonts w:ascii="Wingdings" w:hAnsi="Wingdings" w:hint="default"/>
+        <w:sz w:val="20"/>
+      </w:rPr>
+    </w:lvl>
+    <w:lvl w:ilvl="6" w:tentative="1">
+      <w:start w:val="1"/>
+      <w:numFmt w:val="bullet"/>
+      <w:lvlText w:val=""/>
+      <w:lvlJc w:val="left"/>
+      <w:pPr>
+        <w:tabs>
+          <w:tab w:val="num" w:pos="5040"/>
+        </w:tabs>
+        <w:ind w:left="5040" w:hanging="360"/>
+      </w:pPr>
+      <w:rPr>
+        <w:rFonts w:ascii="Wingdings" w:hAnsi="Wingdings" w:hint="default"/>
+        <w:sz w:val="20"/>
+      </w:rPr>
+    </w:lvl>
+    <w:lvl w:ilvl="7" w:tentative="1">
+      <w:start w:val="1"/>
+      <w:numFmt w:val="bullet"/>
+      <w:lvlText w:val=""/>
+      <w:lvlJc w:val="left"/>
+      <w:pPr>
+        <w:tabs>
+          <w:tab w:val="num" w:pos="5760"/>
+        </w:tabs>
+        <w:ind w:left="5760" w:hanging="360"/>
+      </w:pPr>
+      <w:rPr>
+        <w:rFonts w:ascii="Wingdings" w:hAnsi="Wingdings" w:hint="default"/>
+        <w:sz w:val="20"/>
+      </w:rPr>
+    </w:lvl>
+    <w:lvl w:ilvl="8" w:tentative="1">
+      <w:start w:val="1"/>
+      <w:numFmt w:val="bullet"/>
+      <w:lvlText w:val=""/>
+      <w:lvlJc w:val="left"/>
+      <w:pPr>
+        <w:tabs>
+          <w:tab w:val="num" w:pos="6480"/>
+        </w:tabs>
+        <w:ind w:left="6480" w:hanging="360"/>
+      </w:pPr>
+      <w:rPr>
+        <w:rFonts w:ascii="Wingdings" w:hAnsi="Wingdings" w:hint="default"/>
+        <w:sz w:val="20"/>
+      </w:rPr>
+    </w:lvl>
+  </w:abstractNum>
+  <w:abstractNum w:abstractNumId="3" w15:restartNumberingAfterBreak="0">
     <w:nsid w:val="4D992E15"/>
     <w:multiLevelType w:val="hybridMultilevel"/>
     <w:tmpl w:val="E5186C84"/>
@@ -6796,7 +8331,7 @@
       </w:rPr>
     </w:lvl>
   </w:abstractNum>
-  <w:abstractNum w:abstractNumId="1" w15:restartNumberingAfterBreak="0">
+  <w:abstractNum w:abstractNumId="4" w15:restartNumberingAfterBreak="0">
     <w:nsid w:val="5040655A"/>
     <w:multiLevelType w:val="hybridMultilevel"/>
     <w:tmpl w:val="7CCAE062"/>
@@ -6909,11 +8444,252 @@
       </w:rPr>
     </w:lvl>
   </w:abstractNum>
+  <w:abstractNum w:abstractNumId="5" w15:restartNumberingAfterBreak="0">
+    <w:nsid w:val="6B601ACF"/>
+    <w:multiLevelType w:val="hybridMultilevel"/>
+    <w:tmpl w:val="392EE730"/>
+    <w:lvl w:ilvl="0" w:tplc="04090003">
+      <w:start w:val="1"/>
+      <w:numFmt w:val="bullet"/>
+      <w:lvlText w:val="o"/>
+      <w:lvlJc w:val="left"/>
+      <w:pPr>
+        <w:ind w:left="1080" w:hanging="360"/>
+      </w:pPr>
+      <w:rPr>
+        <w:rFonts w:ascii="Courier New" w:hAnsi="Courier New" w:cs="Courier New" w:hint="default"/>
+      </w:rPr>
+    </w:lvl>
+    <w:lvl w:ilvl="1" w:tplc="04090003" w:tentative="1">
+      <w:start w:val="1"/>
+      <w:numFmt w:val="bullet"/>
+      <w:lvlText w:val="o"/>
+      <w:lvlJc w:val="left"/>
+      <w:pPr>
+        <w:ind w:left="1800" w:hanging="360"/>
+      </w:pPr>
+      <w:rPr>
+        <w:rFonts w:ascii="Courier New" w:hAnsi="Courier New" w:cs="Courier New" w:hint="default"/>
+      </w:rPr>
+    </w:lvl>
+    <w:lvl w:ilvl="2" w:tplc="04090005" w:tentative="1">
+      <w:start w:val="1"/>
+      <w:numFmt w:val="bullet"/>
+      <w:lvlText w:val=""/>
+      <w:lvlJc w:val="left"/>
+      <w:pPr>
+        <w:ind w:left="2520" w:hanging="360"/>
+      </w:pPr>
+      <w:rPr>
+        <w:rFonts w:ascii="Wingdings" w:hAnsi="Wingdings" w:hint="default"/>
+      </w:rPr>
+    </w:lvl>
+    <w:lvl w:ilvl="3" w:tplc="04090001" w:tentative="1">
+      <w:start w:val="1"/>
+      <w:numFmt w:val="bullet"/>
+      <w:lvlText w:val=""/>
+      <w:lvlJc w:val="left"/>
+      <w:pPr>
+        <w:ind w:left="3240" w:hanging="360"/>
+      </w:pPr>
+      <w:rPr>
+        <w:rFonts w:ascii="Symbol" w:hAnsi="Symbol" w:hint="default"/>
+      </w:rPr>
+    </w:lvl>
+    <w:lvl w:ilvl="4" w:tplc="04090003" w:tentative="1">
+      <w:start w:val="1"/>
+      <w:numFmt w:val="bullet"/>
+      <w:lvlText w:val="o"/>
+      <w:lvlJc w:val="left"/>
+      <w:pPr>
+        <w:ind w:left="3960" w:hanging="360"/>
+      </w:pPr>
+      <w:rPr>
+        <w:rFonts w:ascii="Courier New" w:hAnsi="Courier New" w:cs="Courier New" w:hint="default"/>
+      </w:rPr>
+    </w:lvl>
+    <w:lvl w:ilvl="5" w:tplc="04090005" w:tentative="1">
+      <w:start w:val="1"/>
+      <w:numFmt w:val="bullet"/>
+      <w:lvlText w:val=""/>
+      <w:lvlJc w:val="left"/>
+      <w:pPr>
+        <w:ind w:left="4680" w:hanging="360"/>
+      </w:pPr>
+      <w:rPr>
+        <w:rFonts w:ascii="Wingdings" w:hAnsi="Wingdings" w:hint="default"/>
+      </w:rPr>
+    </w:lvl>
+    <w:lvl w:ilvl="6" w:tplc="04090001" w:tentative="1">
+      <w:start w:val="1"/>
+      <w:numFmt w:val="bullet"/>
+      <w:lvlText w:val=""/>
+      <w:lvlJc w:val="left"/>
+      <w:pPr>
+        <w:ind w:left="5400" w:hanging="360"/>
+      </w:pPr>
+      <w:rPr>
+        <w:rFonts w:ascii="Symbol" w:hAnsi="Symbol" w:hint="default"/>
+      </w:rPr>
+    </w:lvl>
+    <w:lvl w:ilvl="7" w:tplc="04090003" w:tentative="1">
+      <w:start w:val="1"/>
+      <w:numFmt w:val="bullet"/>
+      <w:lvlText w:val="o"/>
+      <w:lvlJc w:val="left"/>
+      <w:pPr>
+        <w:ind w:left="6120" w:hanging="360"/>
+      </w:pPr>
+      <w:rPr>
+        <w:rFonts w:ascii="Courier New" w:hAnsi="Courier New" w:cs="Courier New" w:hint="default"/>
+      </w:rPr>
+    </w:lvl>
+    <w:lvl w:ilvl="8" w:tplc="04090005" w:tentative="1">
+      <w:start w:val="1"/>
+      <w:numFmt w:val="bullet"/>
+      <w:lvlText w:val=""/>
+      <w:lvlJc w:val="left"/>
+      <w:pPr>
+        <w:ind w:left="6840" w:hanging="360"/>
+      </w:pPr>
+      <w:rPr>
+        <w:rFonts w:ascii="Wingdings" w:hAnsi="Wingdings" w:hint="default"/>
+      </w:rPr>
+    </w:lvl>
+  </w:abstractNum>
+  <w:abstractNum w:abstractNumId="6" w15:restartNumberingAfterBreak="0">
+    <w:nsid w:val="7C495E5C"/>
+    <w:multiLevelType w:val="hybridMultilevel"/>
+    <w:tmpl w:val="6EA2D198"/>
+    <w:lvl w:ilvl="0" w:tplc="04090001">
+      <w:start w:val="1"/>
+      <w:numFmt w:val="bullet"/>
+      <w:lvlText w:val=""/>
+      <w:lvlJc w:val="left"/>
+      <w:pPr>
+        <w:ind w:left="1080" w:hanging="360"/>
+      </w:pPr>
+      <w:rPr>
+        <w:rFonts w:ascii="Symbol" w:hAnsi="Symbol" w:hint="default"/>
+      </w:rPr>
+    </w:lvl>
+    <w:lvl w:ilvl="1" w:tplc="04090003" w:tentative="1">
+      <w:start w:val="1"/>
+      <w:numFmt w:val="bullet"/>
+      <w:lvlText w:val="o"/>
+      <w:lvlJc w:val="left"/>
+      <w:pPr>
+        <w:ind w:left="1800" w:hanging="360"/>
+      </w:pPr>
+      <w:rPr>
+        <w:rFonts w:ascii="Courier New" w:hAnsi="Courier New" w:cs="Courier New" w:hint="default"/>
+      </w:rPr>
+    </w:lvl>
+    <w:lvl w:ilvl="2" w:tplc="04090005" w:tentative="1">
+      <w:start w:val="1"/>
+      <w:numFmt w:val="bullet"/>
+      <w:lvlText w:val=""/>
+      <w:lvlJc w:val="left"/>
+      <w:pPr>
+        <w:ind w:left="2520" w:hanging="360"/>
+      </w:pPr>
+      <w:rPr>
+        <w:rFonts w:ascii="Wingdings" w:hAnsi="Wingdings" w:hint="default"/>
+      </w:rPr>
+    </w:lvl>
+    <w:lvl w:ilvl="3" w:tplc="04090001" w:tentative="1">
+      <w:start w:val="1"/>
+      <w:numFmt w:val="bullet"/>
+      <w:lvlText w:val=""/>
+      <w:lvlJc w:val="left"/>
+      <w:pPr>
+        <w:ind w:left="3240" w:hanging="360"/>
+      </w:pPr>
+      <w:rPr>
+        <w:rFonts w:ascii="Symbol" w:hAnsi="Symbol" w:hint="default"/>
+      </w:rPr>
+    </w:lvl>
+    <w:lvl w:ilvl="4" w:tplc="04090003" w:tentative="1">
+      <w:start w:val="1"/>
+      <w:numFmt w:val="bullet"/>
+      <w:lvlText w:val="o"/>
+      <w:lvlJc w:val="left"/>
+      <w:pPr>
+        <w:ind w:left="3960" w:hanging="360"/>
+      </w:pPr>
+      <w:rPr>
+        <w:rFonts w:ascii="Courier New" w:hAnsi="Courier New" w:cs="Courier New" w:hint="default"/>
+      </w:rPr>
+    </w:lvl>
+    <w:lvl w:ilvl="5" w:tplc="04090005" w:tentative="1">
+      <w:start w:val="1"/>
+      <w:numFmt w:val="bullet"/>
+      <w:lvlText w:val=""/>
+      <w:lvlJc w:val="left"/>
+      <w:pPr>
+        <w:ind w:left="4680" w:hanging="360"/>
+      </w:pPr>
+      <w:rPr>
+        <w:rFonts w:ascii="Wingdings" w:hAnsi="Wingdings" w:hint="default"/>
+      </w:rPr>
+    </w:lvl>
+    <w:lvl w:ilvl="6" w:tplc="04090001" w:tentative="1">
+      <w:start w:val="1"/>
+      <w:numFmt w:val="bullet"/>
+      <w:lvlText w:val=""/>
+      <w:lvlJc w:val="left"/>
+      <w:pPr>
+        <w:ind w:left="5400" w:hanging="360"/>
+      </w:pPr>
+      <w:rPr>
+        <w:rFonts w:ascii="Symbol" w:hAnsi="Symbol" w:hint="default"/>
+      </w:rPr>
+    </w:lvl>
+    <w:lvl w:ilvl="7" w:tplc="04090003" w:tentative="1">
+      <w:start w:val="1"/>
+      <w:numFmt w:val="bullet"/>
+      <w:lvlText w:val="o"/>
+      <w:lvlJc w:val="left"/>
+      <w:pPr>
+        <w:ind w:left="6120" w:hanging="360"/>
+      </w:pPr>
+      <w:rPr>
+        <w:rFonts w:ascii="Courier New" w:hAnsi="Courier New" w:cs="Courier New" w:hint="default"/>
+      </w:rPr>
+    </w:lvl>
+    <w:lvl w:ilvl="8" w:tplc="04090005" w:tentative="1">
+      <w:start w:val="1"/>
+      <w:numFmt w:val="bullet"/>
+      <w:lvlText w:val=""/>
+      <w:lvlJc w:val="left"/>
+      <w:pPr>
+        <w:ind w:left="6840" w:hanging="360"/>
+      </w:pPr>
+      <w:rPr>
+        <w:rFonts w:ascii="Wingdings" w:hAnsi="Wingdings" w:hint="default"/>
+      </w:rPr>
+    </w:lvl>
+  </w:abstractNum>
   <w:num w:numId="1" w16cid:durableId="1787387872">
+    <w:abstractNumId w:val="4"/>
+  </w:num>
+  <w:num w:numId="2" w16cid:durableId="1739595299">
+    <w:abstractNumId w:val="3"/>
+  </w:num>
+  <w:num w:numId="3" w16cid:durableId="1561205750">
+    <w:abstractNumId w:val="2"/>
+  </w:num>
+  <w:num w:numId="4" w16cid:durableId="1447769764">
+    <w:abstractNumId w:val="5"/>
+  </w:num>
+  <w:num w:numId="5" w16cid:durableId="185021288">
     <w:abstractNumId w:val="1"/>
   </w:num>
-  <w:num w:numId="2" w16cid:durableId="1739595299">
+  <w:num w:numId="6" w16cid:durableId="763310121">
     <w:abstractNumId w:val="0"/>
+  </w:num>
+  <w:num w:numId="7" w16cid:durableId="1791514452">
+    <w:abstractNumId w:val="6"/>
   </w:num>
 </w:numbering>
 </file>

</xml_diff>

<commit_message>
Remove header and footer
</commit_message>
<xml_diff>
--- a/EduSportPro_Proposal_Writing(IT).docx
+++ b/EduSportPro_Proposal_Writing(IT).docx
@@ -9239,6 +9239,7 @@
           <w:rFonts w:ascii="Khmer OS Battambang" w:hAnsi="Khmer OS Battambang" w:cs="Khmer OS Battambang"/>
           <w:sz w:val="24"/>
           <w:szCs w:val="24"/>
+          <w:lang w:val="en-GB"/>
         </w:rPr>
       </w:pPr>
     </w:p>
@@ -12748,6 +12749,7 @@
           <w:szCs w:val="24"/>
           <w:cs/>
         </w:rPr>
+        <w:lastRenderedPageBreak/>
         <w:tab/>
       </w:r>
       <w:r>
@@ -12817,7 +12819,6 @@
           <w:szCs w:val="24"/>
           <w:cs/>
         </w:rPr>
-        <w:lastRenderedPageBreak/>
         <w:tab/>
       </w:r>
       <w:r>
@@ -13516,6 +13517,7 @@
           <w:szCs w:val="24"/>
           <w:cs/>
         </w:rPr>
+        <w:lastRenderedPageBreak/>
         <w:t>ក្នុងដំណាក់កាលនេះ ត្រូវប្រមូលព័ត៌មានដែលពាក់ព័ន្ធនឹងការគ្រប់គ្រងកីឡា ដូចជា ព័ត៌មានកីឡាករ ក្រុម កាលវិភាគហ្វឹកហាត់ និងការប្រកួត។ ទិន្នន័យត្រូវបានប្រមូលពីឯកសារ និងព័ត៌មានដែលមានស្រាប់ ដើម្បីយល់ពីដំណើរការគ្រប់គ្រងបច្ចុប្បន្ន។</w:t>
       </w:r>
     </w:p>
@@ -13606,7 +13608,6 @@
           <w:szCs w:val="24"/>
           <w:cs/>
         </w:rPr>
-        <w:lastRenderedPageBreak/>
         <w:tab/>
       </w:r>
       <w:r>
@@ -14434,6 +14435,7 @@
           <w:cs/>
           <w:lang w:val="en-GB"/>
         </w:rPr>
+        <w:lastRenderedPageBreak/>
         <w:tab/>
       </w:r>
       <w:r>
@@ -15008,6 +15010,7 @@
           <w:cs/>
           <w:lang w:val="en-GB"/>
         </w:rPr>
+        <w:lastRenderedPageBreak/>
         <w:t>៣.</w:t>
       </w:r>
       <w:r>
@@ -15175,7 +15178,6 @@
           <w:szCs w:val="24"/>
           <w:cs/>
         </w:rPr>
-        <w:lastRenderedPageBreak/>
         <w:tab/>
       </w:r>
       <w:r>
@@ -15948,6 +15950,7 @@
           <w:szCs w:val="24"/>
           <w:cs/>
         </w:rPr>
+        <w:lastRenderedPageBreak/>
         <w:tab/>
       </w:r>
       <w:r>
@@ -16241,7 +16244,6 @@
         <w:rPr>
           <w:noProof/>
         </w:rPr>
-        <w:lastRenderedPageBreak/>
         <w:drawing>
           <wp:inline distT="0" distB="0" distL="0" distR="0" wp14:anchorId="0EFBFCB1" wp14:editId="18F79BF1">
             <wp:extent cx="2362200" cy="1328738"/>
@@ -16999,6 +17001,7 @@
           <w:sz w:val="24"/>
           <w:szCs w:val="24"/>
         </w:rPr>
+        <w:lastRenderedPageBreak/>
         <w:t>SQL</w:t>
       </w:r>
       <w:r>
@@ -17094,7 +17097,6 @@
         <w:rPr>
           <w:noProof/>
         </w:rPr>
-        <w:lastRenderedPageBreak/>
         <w:drawing>
           <wp:inline distT="0" distB="0" distL="0" distR="0" wp14:anchorId="35EE69D5" wp14:editId="58159D5A">
             <wp:extent cx="1253067" cy="1253067"/>
@@ -17815,6 +17817,7 @@
           <w:szCs w:val="24"/>
           <w:cs/>
         </w:rPr>
+        <w:lastRenderedPageBreak/>
         <w:tab/>
       </w:r>
       <w:r>
@@ -18069,17 +18072,7 @@
           <w:szCs w:val="24"/>
           <w:cs/>
         </w:rPr>
-        <w:t>ផ្តល់នូវមុខ</w:t>
-      </w:r>
-      <w:r>
-        <w:rPr>
-          <w:rFonts w:ascii="Khmer OS Battambang" w:hAnsi="Khmer OS Battambang" w:cs="Khmer OS Battambang"/>
-          <w:sz w:val="24"/>
-          <w:szCs w:val="24"/>
-          <w:cs/>
-        </w:rPr>
-        <w:lastRenderedPageBreak/>
-        <w:t xml:space="preserve">ងារស្រាប់ជាច្រើន ដូចជា </w:t>
+        <w:t xml:space="preserve">ផ្តល់នូវមុខងារស្រាប់ជាច្រើន ដូចជា </w:t>
       </w:r>
       <w:r>
         <w:rPr>
@@ -18711,6 +18704,7 @@
           <w:szCs w:val="24"/>
           <w:cs/>
         </w:rPr>
+        <w:lastRenderedPageBreak/>
         <w:tab/>
       </w:r>
       <w:r>
@@ -18857,7 +18851,6 @@
         <w:rPr>
           <w:noProof/>
         </w:rPr>
-        <w:lastRenderedPageBreak/>
         <w:drawing>
           <wp:inline distT="0" distB="0" distL="0" distR="0" wp14:anchorId="0A259A33" wp14:editId="5E4B5173">
             <wp:extent cx="948266" cy="948266"/>
@@ -19750,6 +19743,7 @@
         <w:rPr>
           <w:noProof/>
         </w:rPr>
+        <w:lastRenderedPageBreak/>
         <w:drawing>
           <wp:inline distT="0" distB="0" distL="0" distR="0" wp14:anchorId="08514F86" wp14:editId="45924432">
             <wp:extent cx="1024466" cy="916875"/>
@@ -19860,7 +19854,6 @@
           <w:szCs w:val="24"/>
           <w:cs/>
         </w:rPr>
-        <w:lastRenderedPageBreak/>
         <w:tab/>
       </w:r>
       <w:r>
@@ -21935,6 +21928,7 @@
                 <w:cs/>
                 <w:lang w:val="en-GB"/>
               </w:rPr>
+              <w:lastRenderedPageBreak/>
               <w:t>៦</w:t>
             </w:r>
           </w:p>
@@ -22530,7 +22524,6 @@
           <w:szCs w:val="24"/>
           <w:cs/>
         </w:rPr>
-        <w:lastRenderedPageBreak/>
         <w:tab/>
       </w:r>
       <w:r>
@@ -23235,6 +23228,7 @@
           <w:sz w:val="24"/>
           <w:szCs w:val="24"/>
         </w:rPr>
+        <w:lastRenderedPageBreak/>
         <w:t>Pressman, Roger S., and Maxim, Bruce R. (2019</w:t>
       </w:r>
       <w:proofErr w:type="gramStart"/>
@@ -23411,7 +23405,6 @@
           <w:sz w:val="24"/>
           <w:szCs w:val="24"/>
         </w:rPr>
-        <w:lastRenderedPageBreak/>
         <w:t>Hoye, Russell, Smith, Aaron, Nicholson, Matthew, and Stewart, Bob (2015</w:t>
       </w:r>
       <w:proofErr w:type="gramStart"/>
@@ -24092,38 +24085,6 @@
       </w:sdtEndPr>
       <w:sdtContent>
         <w:r>
-          <w:rPr>
-            <w:rFonts w:ascii="Khmer OS Battambang" w:hAnsi="Khmer OS Battambang" w:cs="Khmer OS Battambang"/>
-            <w:szCs w:val="22"/>
-            <w:cs/>
-          </w:rPr>
-          <w:t>ជំនាញ</w:t>
-        </w:r>
-        <w:r>
-          <w:rPr>
-            <w:rFonts w:ascii="Times New Roman" w:hAnsi="Times New Roman" w:cs="Times New Roman" w:hint="cs"/>
-            <w:szCs w:val="22"/>
-            <w:cs/>
-          </w:rPr>
-          <w:t>​</w:t>
-        </w:r>
-        <w:r>
-          <w:rPr>
-            <w:rFonts w:ascii="Khmer OS Battambang" w:hAnsi="Khmer OS Battambang" w:cs="Khmer OS Battambang"/>
-            <w:szCs w:val="22"/>
-            <w:cs/>
-          </w:rPr>
-          <w:t xml:space="preserve"> </w:t>
-        </w:r>
-        <w:r>
-          <w:rPr>
-            <w:rFonts w:ascii="Khmer OS Battambang" w:hAnsi="Khmer OS Battambang" w:cs="Khmer OS Battambang"/>
-            <w:szCs w:val="22"/>
-            <w:cs/>
-          </w:rPr>
-          <w:t>បច្ចេកវិទ្យាព័ត៌មាន</w:t>
-        </w:r>
-        <w:r>
           <w:tab/>
         </w:r>
         <w:r>
@@ -24177,15 +24138,6 @@
       </w:rPr>
       <w:tab/>
     </w:r>
-    <w:r>
-      <w:rPr>
-        <w:rFonts w:ascii="Cambria" w:hAnsi="Cambria" w:cs="Khmer OS Battambang" w:hint="cs"/>
-        <w:noProof/>
-        <w:szCs w:val="22"/>
-        <w:cs/>
-      </w:rPr>
-      <w:t>ជំនាន់ទី ១៩</w:t>
-    </w:r>
   </w:p>
   <w:p>
     <w:pPr>
@@ -24232,59 +24184,9 @@
         <w:b/>
         <w:bCs/>
         <w:cs/>
+        <w:lang w:val="en-GB"/>
       </w:rPr>
     </w:pPr>
-    <w:r>
-      <w:rPr>
-        <w:rFonts w:ascii="Khmer OS Battambang" w:hAnsi="Khmer OS Battambang" w:cs="Khmer OS Battambang"/>
-        <w:b/>
-        <w:bCs/>
-        <w:szCs w:val="22"/>
-        <w:cs/>
-      </w:rPr>
-      <w:t>ស</w:t>
-    </w:r>
-    <w:r>
-      <w:rPr>
-        <w:rFonts w:ascii="Khmer OS Battambang" w:hAnsi="Khmer OS Battambang" w:cs="Khmer OS Battambang" w:hint="cs"/>
-        <w:b/>
-        <w:bCs/>
-        <w:szCs w:val="22"/>
-        <w:cs/>
-      </w:rPr>
-      <w:t>ា</w:t>
-    </w:r>
-    <w:r>
-      <w:rPr>
-        <w:rFonts w:ascii="Khmer OS Battambang" w:hAnsi="Khmer OS Battambang" w:cs="Khmer OS Battambang"/>
-        <w:b/>
-        <w:bCs/>
-        <w:szCs w:val="22"/>
-        <w:cs/>
-      </w:rPr>
-      <w:t>កលវិទ្យាល័ជាតិបាត់ដំប</w:t>
-    </w:r>
-    <w:r>
-      <w:rPr>
-        <w:rFonts w:ascii="Khmer OS Battambang" w:hAnsi="Khmer OS Battambang" w:cs="Khmer OS Battambang" w:hint="cs"/>
-        <w:b/>
-        <w:bCs/>
-        <w:szCs w:val="22"/>
-        <w:cs/>
-      </w:rPr>
-      <w:t>ង</w:t>
-    </w:r>
-    <w:r>
-      <w:rPr>
-        <w:rFonts w:ascii="Khmer OS Battambang" w:hAnsi="Khmer OS Battambang" w:cs="Khmer OS Battambang"/>
-        <w:b/>
-        <w:bCs/>
-        <w:szCs w:val="22"/>
-        <w:cs/>
-      </w:rPr>
-      <w:tab/>
-      <w:t>មហាវិទ្យាល័យវិទ្យាសាស្ត្រ និងបច្ចេកវិទ្យា</w:t>
-    </w:r>
   </w:p>
 </w:hdr>
 </file>

</xml_diff>